<commit_message>
adding updated PRD Documnets
</commit_message>
<xml_diff>
--- a/Capstone_Project/Credit-Risk-Intelligence-Platform/docs/Project_Documents/Credit_Risk_Intelligence_Platform_Design_Doc.docx
+++ b/Capstone_Project/Credit-Risk-Intelligence-Platform/docs/Project_Documents/Credit_Risk_Intelligence_Platform_Design_Doc.docx
@@ -23,12 +23,6 @@
         <w:gridCol w:w="9412"/>
       </w:tblGrid>
       <w:tr>
-        <w:tblPrEx>
-          <w:tblCellMar>
-            <w:top w:w="0" w:type="dxa"/>
-            <w:bottom w:w="0" w:type="dxa"/>
-          </w:tblCellMar>
-        </w:tblPrEx>
         <w:tc>
           <w:tcPr>
             <w:tcW w:w="9412" w:type="dxa"/>
@@ -106,12 +100,6 @@
         <w:gridCol w:w="9412"/>
       </w:tblGrid>
       <w:tr>
-        <w:tblPrEx>
-          <w:tblCellMar>
-            <w:top w:w="0" w:type="dxa"/>
-            <w:bottom w:w="0" w:type="dxa"/>
-          </w:tblCellMar>
-        </w:tblPrEx>
         <w:tc>
           <w:tcPr>
             <w:tcW w:w="9412" w:type="dxa"/>
@@ -184,10 +172,69 @@
       </w:pPr>
       <w:r>
         <w:rPr>
+          <w:b/>
+          <w:bCs/>
           <w:color w:val="555555"/>
         </w:rPr>
-        <w:t>GitHub: github.com/Chaurasiyakash0136/EY-Training-2026</w:t>
-      </w:r>
+        <w:t>GitHub</w:t>
+      </w:r>
+      <w:r>
+        <w:rPr>
+          <w:color w:val="555555"/>
+        </w:rPr>
+        <w:t xml:space="preserve">: </w:t>
+      </w:r>
+      <w:hyperlink r:id="rId7" w:history="1">
+        <w:r>
+          <w:rPr>
+            <w:rStyle w:val="Hyperlink"/>
+          </w:rPr>
+          <w:t>github.com/Chaurasiyakash0136/EY-Training-2026</w:t>
+        </w:r>
+      </w:hyperlink>
+    </w:p>
+    <w:p>
+      <w:pPr>
+        <w:spacing w:before="80" w:after="80" w:line="276" w:lineRule="auto"/>
+        <w:jc w:val="center"/>
+      </w:pPr>
+      <w:r>
+        <w:t xml:space="preserve">   </w:t>
+      </w:r>
+      <w:hyperlink r:id="rId8" w:history="1">
+        <w:r>
+          <w:rPr>
+            <w:rStyle w:val="Hyperlink"/>
+          </w:rPr>
+          <w:t>ashusharma2002/</w:t>
+        </w:r>
+        <w:proofErr w:type="spellStart"/>
+        <w:r>
+          <w:rPr>
+            <w:rStyle w:val="Hyperlink"/>
+          </w:rPr>
+          <w:t>Ey_Training_AI_ML_Assig</w:t>
+        </w:r>
+        <w:r>
+          <w:rPr>
+            <w:rStyle w:val="Hyperlink"/>
+          </w:rPr>
+          <w:t>n</w:t>
+        </w:r>
+        <w:r>
+          <w:rPr>
+            <w:rStyle w:val="Hyperlink"/>
+          </w:rPr>
+          <w:t>ments</w:t>
+        </w:r>
+        <w:proofErr w:type="spellEnd"/>
+      </w:hyperlink>
+    </w:p>
+    <w:p>
+      <w:pPr>
+        <w:spacing w:before="80" w:after="80" w:line="276" w:lineRule="auto"/>
+        <w:jc w:val="center"/>
+      </w:pPr>
     </w:p>
     <w:p>
       <w:r>
@@ -245,13 +292,8 @@
       <w:pPr>
         <w:pStyle w:val="Heading2"/>
       </w:pPr>
-      <w:proofErr w:type="gramStart"/>
-      <w:r>
-        <w:t>2.1  Market</w:t>
-      </w:r>
-      <w:proofErr w:type="gramEnd"/>
-      <w:r>
-        <w:t xml:space="preserve"> Overview</w:t>
+      <w:r>
+        <w:t>2.1  Market Overview</w:t>
       </w:r>
     </w:p>
     <w:p>
@@ -281,16 +323,8 @@
       <w:pPr>
         <w:pStyle w:val="Heading2"/>
       </w:pPr>
-      <w:proofErr w:type="gramStart"/>
-      <w:r>
-        <w:t>2.2  Key</w:t>
-      </w:r>
-      <w:proofErr w:type="gramEnd"/>
-      <w:r>
-        <w:t xml:space="preserve"> Competitors</w:t>
-      </w:r>
-      <w:r>
-        <w:t xml:space="preserve"> </w:t>
+      <w:r>
+        <w:t xml:space="preserve">2.2  Key Competitors </w:t>
       </w:r>
       <w:r>
         <w:rPr>
@@ -350,12 +384,6 @@
         <w:gridCol w:w="1592"/>
       </w:tblGrid>
       <w:tr>
-        <w:tblPrEx>
-          <w:tblCellMar>
-            <w:top w:w="0" w:type="dxa"/>
-            <w:bottom w:w="0" w:type="dxa"/>
-          </w:tblCellMar>
-        </w:tblPrEx>
         <w:trPr>
           <w:tblHeader/>
         </w:trPr>
@@ -609,12 +637,6 @@
         </w:tc>
       </w:tr>
       <w:tr>
-        <w:tblPrEx>
-          <w:tblCellMar>
-            <w:top w:w="0" w:type="dxa"/>
-            <w:bottom w:w="0" w:type="dxa"/>
-          </w:tblCellMar>
-        </w:tblPrEx>
         <w:tc>
           <w:tcPr>
             <w:tcW w:w="1077" w:type="dxa"/>
@@ -718,7 +740,23 @@
                 <w:sz w:val="16"/>
                 <w:szCs w:val="16"/>
               </w:rPr>
-              <w:t xml:space="preserve"> 4 specialist agents</w:t>
+              <w:t xml:space="preserve"> </w:t>
+            </w:r>
+            <w:r>
+              <w:rPr>
+                <w:color w:val="1A7A3C"/>
+                <w:sz w:val="16"/>
+                <w:szCs w:val="16"/>
+              </w:rPr>
+              <w:t>3</w:t>
+            </w:r>
+            <w:r>
+              <w:rPr>
+                <w:color w:val="1A7A3C"/>
+                <w:sz w:val="16"/>
+                <w:szCs w:val="16"/>
+              </w:rPr>
+              <w:t xml:space="preserve"> specialist agents</w:t>
             </w:r>
           </w:p>
         </w:tc>
@@ -914,12 +952,6 @@
         </w:tc>
       </w:tr>
       <w:tr>
-        <w:tblPrEx>
-          <w:tblCellMar>
-            <w:top w:w="0" w:type="dxa"/>
-            <w:bottom w:w="0" w:type="dxa"/>
-          </w:tblCellMar>
-        </w:tblPrEx>
         <w:tc>
           <w:tcPr>
             <w:tcW w:w="1077" w:type="dxa"/>
@@ -939,7 +971,6 @@
             <w:vAlign w:val="center"/>
           </w:tcPr>
           <w:p>
-            <w:proofErr w:type="spellStart"/>
             <w:r>
               <w:rPr>
                 <w:sz w:val="17"/>
@@ -947,7 +978,6 @@
               </w:rPr>
               <w:t>Hebbia</w:t>
             </w:r>
-            <w:proofErr w:type="spellEnd"/>
           </w:p>
         </w:tc>
         <w:tc>
@@ -1218,12 +1248,6 @@
         </w:tc>
       </w:tr>
       <w:tr>
-        <w:tblPrEx>
-          <w:tblCellMar>
-            <w:top w:w="0" w:type="dxa"/>
-            <w:bottom w:w="0" w:type="dxa"/>
-          </w:tblCellMar>
-        </w:tblPrEx>
         <w:tc>
           <w:tcPr>
             <w:tcW w:w="1077" w:type="dxa"/>
@@ -1286,18 +1310,8 @@
                 <w:sz w:val="16"/>
                 <w:szCs w:val="16"/>
               </w:rPr>
-              <w:t xml:space="preserve"> Financial </w:t>
-            </w:r>
-            <w:proofErr w:type="spellStart"/>
-            <w:r>
-              <w:rPr>
-                <w:color w:val="1A7A3C"/>
-                <w:sz w:val="16"/>
-                <w:szCs w:val="16"/>
-              </w:rPr>
-              <w:t>stmts</w:t>
-            </w:r>
-            <w:proofErr w:type="spellEnd"/>
+              <w:t xml:space="preserve"> Financial stmts</w:t>
+            </w:r>
           </w:p>
         </w:tc>
         <w:tc>
@@ -1530,12 +1544,6 @@
         </w:tc>
       </w:tr>
       <w:tr>
-        <w:tblPrEx>
-          <w:tblCellMar>
-            <w:top w:w="0" w:type="dxa"/>
-            <w:bottom w:w="0" w:type="dxa"/>
-          </w:tblCellMar>
-        </w:tblPrEx>
         <w:tc>
           <w:tcPr>
             <w:tcW w:w="1077" w:type="dxa"/>
@@ -1560,17 +1568,8 @@
                 <w:sz w:val="17"/>
                 <w:szCs w:val="17"/>
               </w:rPr>
-              <w:t xml:space="preserve">Moody's </w:t>
-            </w:r>
-            <w:proofErr w:type="spellStart"/>
-            <w:r>
-              <w:rPr>
-                <w:sz w:val="17"/>
-                <w:szCs w:val="17"/>
-              </w:rPr>
-              <w:t>MaxSight</w:t>
-            </w:r>
-            <w:proofErr w:type="spellEnd"/>
+              <w:t>Moody's MaxSight</w:t>
+            </w:r>
           </w:p>
         </w:tc>
         <w:tc>
@@ -1841,12 +1840,6 @@
         </w:tc>
       </w:tr>
       <w:tr>
-        <w:tblPrEx>
-          <w:tblCellMar>
-            <w:top w:w="0" w:type="dxa"/>
-            <w:bottom w:w="0" w:type="dxa"/>
-          </w:tblCellMar>
-        </w:tblPrEx>
         <w:tc>
           <w:tcPr>
             <w:tcW w:w="1077" w:type="dxa"/>
@@ -1866,7 +1859,6 @@
             <w:vAlign w:val="center"/>
           </w:tcPr>
           <w:p>
-            <w:proofErr w:type="spellStart"/>
             <w:r>
               <w:rPr>
                 <w:sz w:val="17"/>
@@ -1874,7 +1866,6 @@
               </w:rPr>
               <w:t>OakNorth</w:t>
             </w:r>
-            <w:proofErr w:type="spellEnd"/>
           </w:p>
         </w:tc>
         <w:tc>
@@ -2145,12 +2136,6 @@
         </w:tc>
       </w:tr>
       <w:tr>
-        <w:tblPrEx>
-          <w:tblCellMar>
-            <w:top w:w="0" w:type="dxa"/>
-            <w:bottom w:w="0" w:type="dxa"/>
-          </w:tblCellMar>
-        </w:tblPrEx>
         <w:tc>
           <w:tcPr>
             <w:tcW w:w="1077" w:type="dxa"/>
@@ -2170,7 +2155,6 @@
             <w:vAlign w:val="center"/>
           </w:tcPr>
           <w:p>
-            <w:proofErr w:type="spellStart"/>
             <w:r>
               <w:rPr>
                 <w:sz w:val="17"/>
@@ -2178,7 +2162,6 @@
               </w:rPr>
               <w:t>AlphaSense</w:t>
             </w:r>
-            <w:proofErr w:type="spellEnd"/>
           </w:p>
         </w:tc>
         <w:tc>
@@ -2449,12 +2432,6 @@
         </w:tc>
       </w:tr>
       <w:tr>
-        <w:tblPrEx>
-          <w:tblCellMar>
-            <w:top w:w="0" w:type="dxa"/>
-            <w:bottom w:w="0" w:type="dxa"/>
-          </w:tblCellMar>
-        </w:tblPrEx>
         <w:tc>
           <w:tcPr>
             <w:tcW w:w="1077" w:type="dxa"/>
@@ -2844,20 +2821,9 @@
       <w:pPr>
         <w:pStyle w:val="Heading2"/>
       </w:pPr>
-      <w:proofErr w:type="gramStart"/>
       <w:r>
         <w:lastRenderedPageBreak/>
-        <w:t>2.</w:t>
-      </w:r>
-      <w:r>
-        <w:t>3</w:t>
-      </w:r>
-      <w:r>
-        <w:t xml:space="preserve">  Market</w:t>
-      </w:r>
-      <w:proofErr w:type="gramEnd"/>
-      <w:r>
-        <w:t xml:space="preserve"> Gaps</w:t>
+        <w:t>2.3  Market Gaps</w:t>
       </w:r>
     </w:p>
     <w:p>
@@ -3096,6 +3062,32 @@
       </w:pPr>
       <w:r>
         <w:t>Giving applicants a clear recovery roadmap — turning a rejection into a starting point for financial improvement.</w:t>
+      </w:r>
+    </w:p>
+    <w:p>
+      <w:pPr>
+        <w:pStyle w:val="ListParagraph"/>
+        <w:numPr>
+          <w:ilvl w:val="0"/>
+          <w:numId w:val="2"/>
+        </w:numPr>
+        <w:spacing w:before="40" w:after="40" w:line="276" w:lineRule="auto"/>
+      </w:pPr>
+      <w:r>
+        <w:t>Giving banks and applicants their own secure, login-protected view of the platform, so each side sees the information and tools built for their role.</w:t>
+      </w:r>
+    </w:p>
+    <w:p>
+      <w:pPr>
+        <w:pStyle w:val="ListParagraph"/>
+        <w:numPr>
+          <w:ilvl w:val="0"/>
+          <w:numId w:val="2"/>
+        </w:numPr>
+        <w:spacing w:before="40" w:after="40" w:line="276" w:lineRule="auto"/>
+      </w:pPr>
+      <w:r>
+        <w:t>Helping applicants plan ahead financially with a built-in retirement calculator, alongside their credit journey.</w:t>
       </w:r>
     </w:p>
     <w:p>
@@ -3137,12 +3129,6 @@
         <w:gridCol w:w="7252"/>
       </w:tblGrid>
       <w:tr>
-        <w:tblPrEx>
-          <w:tblCellMar>
-            <w:top w:w="0" w:type="dxa"/>
-            <w:bottom w:w="0" w:type="dxa"/>
-          </w:tblCellMar>
-        </w:tblPrEx>
         <w:tc>
           <w:tcPr>
             <w:tcW w:w="2160" w:type="dxa"/>
@@ -3204,18 +3190,33 @@
                 <w:sz w:val="18"/>
                 <w:szCs w:val="18"/>
               </w:rPr>
-              <w:t>The platform is designed for credit analysts working inside commercial lending banks. It is also built for loan applicants who want to track their active loan applications.</w:t>
+              <w:t xml:space="preserve">The platform serves two separate, securely logged-in user types: Financial Institutions (bank officers who review and decide on loan applications) and Customers (loan applicants who want </w:t>
+            </w:r>
+            <w:r>
+              <w:rPr>
+                <w:sz w:val="18"/>
+                <w:szCs w:val="18"/>
+              </w:rPr>
+              <w:t xml:space="preserve">to take recommendation before applying for a </w:t>
+            </w:r>
+            <w:r>
+              <w:rPr>
+                <w:sz w:val="18"/>
+                <w:szCs w:val="18"/>
+              </w:rPr>
+              <w:t>loan)</w:t>
+            </w:r>
+            <w:r>
+              <w:rPr>
+                <w:sz w:val="18"/>
+                <w:szCs w:val="18"/>
+              </w:rPr>
+              <w:t>. Each user logs in and sees a dashboard built specifically for their role.</w:t>
             </w:r>
           </w:p>
         </w:tc>
       </w:tr>
       <w:tr>
-        <w:tblPrEx>
-          <w:tblCellMar>
-            <w:top w:w="0" w:type="dxa"/>
-            <w:bottom w:w="0" w:type="dxa"/>
-          </w:tblCellMar>
-        </w:tblPrEx>
         <w:tc>
           <w:tcPr>
             <w:tcW w:w="2160" w:type="dxa"/>
@@ -3246,6 +3247,7 @@
                 <w:sz w:val="18"/>
                 <w:szCs w:val="18"/>
               </w:rPr>
+              <w:lastRenderedPageBreak/>
               <w:t>The Core Pain Point</w:t>
             </w:r>
           </w:p>
@@ -3283,12 +3285,6 @@
         </w:tc>
       </w:tr>
       <w:tr>
-        <w:tblPrEx>
-          <w:tblCellMar>
-            <w:top w:w="0" w:type="dxa"/>
-            <w:bottom w:w="0" w:type="dxa"/>
-          </w:tblCellMar>
-        </w:tblPrEx>
         <w:tc>
           <w:tcPr>
             <w:tcW w:w="2160" w:type="dxa"/>
@@ -3356,12 +3352,6 @@
         </w:tc>
       </w:tr>
       <w:tr>
-        <w:tblPrEx>
-          <w:tblCellMar>
-            <w:top w:w="0" w:type="dxa"/>
-            <w:bottom w:w="0" w:type="dxa"/>
-          </w:tblCellMar>
-        </w:tblPrEx>
         <w:tc>
           <w:tcPr>
             <w:tcW w:w="2160" w:type="dxa"/>
@@ -3392,7 +3382,6 @@
                 <w:sz w:val="18"/>
                 <w:szCs w:val="18"/>
               </w:rPr>
-              <w:lastRenderedPageBreak/>
               <w:t>Data Sources</w:t>
             </w:r>
           </w:p>
@@ -3424,18 +3413,12 @@
                 <w:sz w:val="18"/>
                 <w:szCs w:val="18"/>
               </w:rPr>
-              <w:t>The system will process official financial PDF documents uploaded directly by the user. These include Bank Statements, Income Tax Returns (ITR), Balance Sheets, and Profit &amp; Loss statements.</w:t>
+              <w:t>The system will process official financial PDF documents. These include Bank Statements, Income Tax Returns (ITR), Balance Sheets, and Profit &amp; Loss statements.</w:t>
             </w:r>
           </w:p>
         </w:tc>
       </w:tr>
       <w:tr>
-        <w:tblPrEx>
-          <w:tblCellMar>
-            <w:top w:w="0" w:type="dxa"/>
-            <w:bottom w:w="0" w:type="dxa"/>
-          </w:tblCellMar>
-        </w:tblPrEx>
         <w:tc>
           <w:tcPr>
             <w:tcW w:w="2160" w:type="dxa"/>
@@ -3543,12 +3526,6 @@
         <w:gridCol w:w="5592"/>
       </w:tblGrid>
       <w:tr>
-        <w:tblPrEx>
-          <w:tblCellMar>
-            <w:top w:w="0" w:type="dxa"/>
-            <w:bottom w:w="0" w:type="dxa"/>
-          </w:tblCellMar>
-        </w:tblPrEx>
         <w:trPr>
           <w:tblHeader/>
         </w:trPr>
@@ -3659,12 +3636,6 @@
         </w:tc>
       </w:tr>
       <w:tr>
-        <w:tblPrEx>
-          <w:tblCellMar>
-            <w:top w:w="0" w:type="dxa"/>
-            <w:bottom w:w="0" w:type="dxa"/>
-          </w:tblCellMar>
-        </w:tblPrEx>
         <w:tc>
           <w:tcPr>
             <w:tcW w:w="2240" w:type="dxa"/>
@@ -3760,12 +3731,6 @@
         </w:tc>
       </w:tr>
       <w:tr>
-        <w:tblPrEx>
-          <w:tblCellMar>
-            <w:top w:w="0" w:type="dxa"/>
-            <w:bottom w:w="0" w:type="dxa"/>
-          </w:tblCellMar>
-        </w:tblPrEx>
         <w:tc>
           <w:tcPr>
             <w:tcW w:w="2240" w:type="dxa"/>
@@ -3855,18 +3820,12 @@
                 <w:sz w:val="18"/>
                 <w:szCs w:val="18"/>
               </w:rPr>
-              <w:t>Provides conversational follow-up questions and answers. The chat is strictly based on the uploaded document contents to help resolve any questions the credit analyst might have.</w:t>
+              <w:t>Provides conversational follow-up questions and answers for logged-in users on both sides of the platform. The chat combines keyword and meaning-based search (hybrid retrieval) and stays strictly grounded in the uploaded document contents.</w:t>
             </w:r>
           </w:p>
         </w:tc>
       </w:tr>
       <w:tr>
-        <w:tblPrEx>
-          <w:tblCellMar>
-            <w:top w:w="0" w:type="dxa"/>
-            <w:bottom w:w="0" w:type="dxa"/>
-          </w:tblCellMar>
-        </w:tblPrEx>
         <w:tc>
           <w:tcPr>
             <w:tcW w:w="2240" w:type="dxa"/>
@@ -3983,13 +3942,8 @@
       <w:pPr>
         <w:pStyle w:val="Heading2"/>
       </w:pPr>
-      <w:proofErr w:type="gramStart"/>
-      <w:r>
-        <w:t>6.1  Dynamic</w:t>
-      </w:r>
-      <w:proofErr w:type="gramEnd"/>
-      <w:r>
-        <w:t xml:space="preserve"> Recommendation Features</w:t>
+      <w:r>
+        <w:t>6.1  Dynamic Recommendation Features</w:t>
       </w:r>
     </w:p>
     <w:tbl>
@@ -4014,12 +3968,6 @@
         <w:gridCol w:w="7252"/>
       </w:tblGrid>
       <w:tr>
-        <w:tblPrEx>
-          <w:tblCellMar>
-            <w:top w:w="0" w:type="dxa"/>
-            <w:bottom w:w="0" w:type="dxa"/>
-          </w:tblCellMar>
-        </w:tblPrEx>
         <w:tc>
           <w:tcPr>
             <w:tcW w:w="2160" w:type="dxa"/>
@@ -4087,12 +4035,6 @@
         </w:tc>
       </w:tr>
       <w:tr>
-        <w:tblPrEx>
-          <w:tblCellMar>
-            <w:top w:w="0" w:type="dxa"/>
-            <w:bottom w:w="0" w:type="dxa"/>
-          </w:tblCellMar>
-        </w:tblPrEx>
         <w:tc>
           <w:tcPr>
             <w:tcW w:w="2160" w:type="dxa"/>
@@ -4160,12 +4102,6 @@
         </w:tc>
       </w:tr>
       <w:tr>
-        <w:tblPrEx>
-          <w:tblCellMar>
-            <w:top w:w="0" w:type="dxa"/>
-            <w:bottom w:w="0" w:type="dxa"/>
-          </w:tblCellMar>
-        </w:tblPrEx>
         <w:tc>
           <w:tcPr>
             <w:tcW w:w="2160" w:type="dxa"/>
@@ -4233,12 +4169,6 @@
         </w:tc>
       </w:tr>
       <w:tr>
-        <w:tblPrEx>
-          <w:tblCellMar>
-            <w:top w:w="0" w:type="dxa"/>
-            <w:bottom w:w="0" w:type="dxa"/>
-          </w:tblCellMar>
-        </w:tblPrEx>
         <w:tc>
           <w:tcPr>
             <w:tcW w:w="2160" w:type="dxa"/>
@@ -4316,13 +4246,8 @@
       <w:pPr>
         <w:pStyle w:val="Heading2"/>
       </w:pPr>
-      <w:proofErr w:type="gramStart"/>
-      <w:r>
-        <w:t>6.2  Document</w:t>
-      </w:r>
-      <w:proofErr w:type="gramEnd"/>
-      <w:r>
-        <w:t xml:space="preserve"> Analysis Features</w:t>
+      <w:r>
+        <w:t>6.2  Document Analysis Features</w:t>
       </w:r>
     </w:p>
     <w:tbl>
@@ -4347,12 +4272,6 @@
         <w:gridCol w:w="7252"/>
       </w:tblGrid>
       <w:tr>
-        <w:tblPrEx>
-          <w:tblCellMar>
-            <w:top w:w="0" w:type="dxa"/>
-            <w:bottom w:w="0" w:type="dxa"/>
-          </w:tblCellMar>
-        </w:tblPrEx>
         <w:tc>
           <w:tcPr>
             <w:tcW w:w="2160" w:type="dxa"/>
@@ -4420,12 +4339,6 @@
         </w:tc>
       </w:tr>
       <w:tr>
-        <w:tblPrEx>
-          <w:tblCellMar>
-            <w:top w:w="0" w:type="dxa"/>
-            <w:bottom w:w="0" w:type="dxa"/>
-          </w:tblCellMar>
-        </w:tblPrEx>
         <w:tc>
           <w:tcPr>
             <w:tcW w:w="2160" w:type="dxa"/>
@@ -4456,7 +4369,6 @@
                 <w:sz w:val="18"/>
                 <w:szCs w:val="18"/>
               </w:rPr>
-              <w:lastRenderedPageBreak/>
               <w:t>Financial PDF Uploads</w:t>
             </w:r>
           </w:p>
@@ -4494,12 +4406,6 @@
         </w:tc>
       </w:tr>
       <w:tr>
-        <w:tblPrEx>
-          <w:tblCellMar>
-            <w:top w:w="0" w:type="dxa"/>
-            <w:bottom w:w="0" w:type="dxa"/>
-          </w:tblCellMar>
-        </w:tblPrEx>
         <w:tc>
           <w:tcPr>
             <w:tcW w:w="2160" w:type="dxa"/>
@@ -4567,12 +4473,6 @@
         </w:tc>
       </w:tr>
       <w:tr>
-        <w:tblPrEx>
-          <w:tblCellMar>
-            <w:top w:w="0" w:type="dxa"/>
-            <w:bottom w:w="0" w:type="dxa"/>
-          </w:tblCellMar>
-        </w:tblPrEx>
         <w:tc>
           <w:tcPr>
             <w:tcW w:w="2160" w:type="dxa"/>
@@ -4650,13 +4550,8 @@
       <w:pPr>
         <w:pStyle w:val="Heading2"/>
       </w:pPr>
-      <w:proofErr w:type="gramStart"/>
-      <w:r>
-        <w:t>6.3  User</w:t>
-      </w:r>
-      <w:proofErr w:type="gramEnd"/>
-      <w:r>
-        <w:t xml:space="preserve"> Interface Layout Plan</w:t>
+      <w:r>
+        <w:t>6.3  User Interface Layout Plan</w:t>
       </w:r>
     </w:p>
     <w:p>
@@ -4665,15 +4560,7 @@
         <w:jc w:val="both"/>
       </w:pPr>
       <w:r>
-        <w:t xml:space="preserve">The platform is built on a clean, intuitive </w:t>
-      </w:r>
-      <w:proofErr w:type="spellStart"/>
-      <w:r>
-        <w:t>Streamlit</w:t>
-      </w:r>
-      <w:proofErr w:type="spellEnd"/>
-      <w:r>
-        <w:t xml:space="preserve"> dashboard designed for both technical and non-technical users. The interface is organised into a left navigation sidebar and a main content area with six dedicated pages.</w:t>
+        <w:t>The platform is built on a clean, intuitive Streamlit dashboard designed for both technical and non-technical users. Users log in as either a Customer or a Financial Institution, and the interface is organised into a left navigation sidebar and a main content area with eight dedicated pages.</w:t>
       </w:r>
     </w:p>
     <w:p>
@@ -4714,7 +4601,7 @@
         <w:spacing w:before="40" w:after="40" w:line="276" w:lineRule="auto"/>
       </w:pPr>
       <w:r>
-        <w:t>Navigation menu with six pages — Dashboard, Upload Documents, Document Summary, Risk Analysis, AI Recommendations and AI Chat.</w:t>
+        <w:t>Navigation menu with eight pages — Login/Register, Dashboard, Upload Documents, Document Summary, Risk Analysis, AI Recommendations, AI Chat and Retirement Planner.</w:t>
       </w:r>
     </w:p>
     <w:p>
@@ -4784,12 +4671,6 @@
         <w:gridCol w:w="7032"/>
       </w:tblGrid>
       <w:tr>
-        <w:tblPrEx>
-          <w:tblCellMar>
-            <w:top w:w="0" w:type="dxa"/>
-            <w:bottom w:w="0" w:type="dxa"/>
-          </w:tblCellMar>
-        </w:tblPrEx>
         <w:tc>
           <w:tcPr>
             <w:tcW w:w="2380" w:type="dxa"/>
@@ -4820,7 +4701,7 @@
                 <w:sz w:val="18"/>
                 <w:szCs w:val="18"/>
               </w:rPr>
-              <w:t>Dashboard</w:t>
+              <w:t>Login / Register</w:t>
             </w:r>
           </w:p>
         </w:tc>
@@ -4851,18 +4732,12 @@
                 <w:sz w:val="18"/>
                 <w:szCs w:val="18"/>
               </w:rPr>
-              <w:t>The home screen giving a complete overview of the current session — documents uploaded, risk score summary, key financial highlights and quick access to all sections.</w:t>
+              <w:t>The entry point to the platform. Users create an account or sign in securely, and choose whether they are a Customer or a Financial Institution, which decides which dashboard they see next.</w:t>
             </w:r>
           </w:p>
         </w:tc>
       </w:tr>
       <w:tr>
-        <w:tblPrEx>
-          <w:tblCellMar>
-            <w:top w:w="0" w:type="dxa"/>
-            <w:bottom w:w="0" w:type="dxa"/>
-          </w:tblCellMar>
-        </w:tblPrEx>
         <w:tc>
           <w:tcPr>
             <w:tcW w:w="2380" w:type="dxa"/>
@@ -4893,7 +4768,7 @@
                 <w:sz w:val="18"/>
                 <w:szCs w:val="18"/>
               </w:rPr>
-              <w:t>Upload Documents</w:t>
+              <w:t>Dashboard</w:t>
             </w:r>
           </w:p>
         </w:tc>
@@ -4906,36 +4781,30 @@
               <w:bottom w:val="single" w:sz="4" w:space="0" w:color="CCDDEE"/>
               <w:right w:val="single" w:sz="4" w:space="0" w:color="CCDDEE"/>
             </w:tcBorders>
-            <w:shd w:val="clear" w:color="auto" w:fill="F2F8FF"/>
-            <w:tcMar>
-              <w:top w:w="80" w:type="dxa"/>
-              <w:left w:w="120" w:type="dxa"/>
-              <w:bottom w:w="80" w:type="dxa"/>
-              <w:right w:w="120" w:type="dxa"/>
-            </w:tcMar>
-          </w:tcPr>
-          <w:p>
-            <w:pPr>
-              <w:spacing w:before="80" w:after="80" w:line="276" w:lineRule="auto"/>
-              <w:jc w:val="both"/>
-            </w:pPr>
-            <w:r>
-              <w:rPr>
-                <w:sz w:val="18"/>
-                <w:szCs w:val="18"/>
-              </w:rPr>
-              <w:t>Dedicated page for uploading financial PDFs. Supports multiple file uploads at once with real-time processing status for each document.</w:t>
+            <w:shd w:val="clear" w:color="auto" w:fill="FFFFFF"/>
+            <w:tcMar>
+              <w:top w:w="80" w:type="dxa"/>
+              <w:left w:w="120" w:type="dxa"/>
+              <w:bottom w:w="80" w:type="dxa"/>
+              <w:right w:w="120" w:type="dxa"/>
+            </w:tcMar>
+          </w:tcPr>
+          <w:p>
+            <w:pPr>
+              <w:spacing w:before="80" w:after="80" w:line="276" w:lineRule="auto"/>
+              <w:jc w:val="both"/>
+            </w:pPr>
+            <w:r>
+              <w:rPr>
+                <w:sz w:val="18"/>
+                <w:szCs w:val="18"/>
+              </w:rPr>
+              <w:t>The home screen giving a complete overview of the current session — documents uploaded, risk score summary, key financial highlights and quick access to all sections.</w:t>
             </w:r>
           </w:p>
         </w:tc>
       </w:tr>
       <w:tr>
-        <w:tblPrEx>
-          <w:tblCellMar>
-            <w:top w:w="0" w:type="dxa"/>
-            <w:bottom w:w="0" w:type="dxa"/>
-          </w:tblCellMar>
-        </w:tblPrEx>
         <w:tc>
           <w:tcPr>
             <w:tcW w:w="2380" w:type="dxa"/>
@@ -4966,7 +4835,7 @@
                 <w:sz w:val="18"/>
                 <w:szCs w:val="18"/>
               </w:rPr>
-              <w:t>Document Summary</w:t>
+              <w:t>Upload Documents</w:t>
             </w:r>
           </w:p>
         </w:tc>
@@ -4979,36 +4848,30 @@
               <w:bottom w:val="single" w:sz="4" w:space="0" w:color="CCDDEE"/>
               <w:right w:val="single" w:sz="4" w:space="0" w:color="CCDDEE"/>
             </w:tcBorders>
-            <w:shd w:val="clear" w:color="auto" w:fill="FFFFFF"/>
-            <w:tcMar>
-              <w:top w:w="80" w:type="dxa"/>
-              <w:left w:w="120" w:type="dxa"/>
-              <w:bottom w:w="80" w:type="dxa"/>
-              <w:right w:w="120" w:type="dxa"/>
-            </w:tcMar>
-          </w:tcPr>
-          <w:p>
-            <w:pPr>
-              <w:spacing w:before="80" w:after="80" w:line="276" w:lineRule="auto"/>
-              <w:jc w:val="both"/>
-            </w:pPr>
-            <w:r>
-              <w:rPr>
-                <w:sz w:val="18"/>
-                <w:szCs w:val="18"/>
-              </w:rPr>
-              <w:t>Displays a clean AI-generated summary of all uploaded documents — income overview, expense patterns, profit trends and key financial figures extracted automatically.</w:t>
+            <w:shd w:val="clear" w:color="auto" w:fill="F2F8FF"/>
+            <w:tcMar>
+              <w:top w:w="80" w:type="dxa"/>
+              <w:left w:w="120" w:type="dxa"/>
+              <w:bottom w:w="80" w:type="dxa"/>
+              <w:right w:w="120" w:type="dxa"/>
+            </w:tcMar>
+          </w:tcPr>
+          <w:p>
+            <w:pPr>
+              <w:spacing w:before="80" w:after="80" w:line="276" w:lineRule="auto"/>
+              <w:jc w:val="both"/>
+            </w:pPr>
+            <w:r>
+              <w:rPr>
+                <w:sz w:val="18"/>
+                <w:szCs w:val="18"/>
+              </w:rPr>
+              <w:t>Dedicated page for uploading financial PDFs. Supports multiple file uploads at once with real-time processing status for each document.</w:t>
             </w:r>
           </w:p>
         </w:tc>
       </w:tr>
       <w:tr>
-        <w:tblPrEx>
-          <w:tblCellMar>
-            <w:top w:w="0" w:type="dxa"/>
-            <w:bottom w:w="0" w:type="dxa"/>
-          </w:tblCellMar>
-        </w:tblPrEx>
         <w:tc>
           <w:tcPr>
             <w:tcW w:w="2380" w:type="dxa"/>
@@ -5039,7 +4902,8 @@
                 <w:sz w:val="18"/>
                 <w:szCs w:val="18"/>
               </w:rPr>
-              <w:t>Risk Analysis</w:t>
+              <w:lastRenderedPageBreak/>
+              <w:t>Document Summary</w:t>
             </w:r>
           </w:p>
         </w:tc>
@@ -5052,36 +4916,30 @@
               <w:bottom w:val="single" w:sz="4" w:space="0" w:color="CCDDEE"/>
               <w:right w:val="single" w:sz="4" w:space="0" w:color="CCDDEE"/>
             </w:tcBorders>
-            <w:shd w:val="clear" w:color="auto" w:fill="F2F8FF"/>
-            <w:tcMar>
-              <w:top w:w="80" w:type="dxa"/>
-              <w:left w:w="120" w:type="dxa"/>
-              <w:bottom w:w="80" w:type="dxa"/>
-              <w:right w:w="120" w:type="dxa"/>
-            </w:tcMar>
-          </w:tcPr>
-          <w:p>
-            <w:pPr>
-              <w:spacing w:before="80" w:after="80" w:line="276" w:lineRule="auto"/>
-              <w:jc w:val="both"/>
-            </w:pPr>
-            <w:r>
-              <w:rPr>
-                <w:sz w:val="18"/>
-                <w:szCs w:val="18"/>
-              </w:rPr>
-              <w:t>The core analysis page showing a visual risk score gauge (0-100) with Low, Moderate and High levels; a Risk Breakdown bar chart summarising Strengths, Weaknesses, Red Flags and Missing Information; a warning banner when concerns outweigh positives; and four detailed tabs — Strengths, Weaknesses, Red Flags and Missing Info — each listing specific findings extracted directly from the uploaded financial documents. All findings are fully grounded in the actual uploaded documents — no assumptions or guesswork involved.</w:t>
+            <w:shd w:val="clear" w:color="auto" w:fill="FFFFFF"/>
+            <w:tcMar>
+              <w:top w:w="80" w:type="dxa"/>
+              <w:left w:w="120" w:type="dxa"/>
+              <w:bottom w:w="80" w:type="dxa"/>
+              <w:right w:w="120" w:type="dxa"/>
+            </w:tcMar>
+          </w:tcPr>
+          <w:p>
+            <w:pPr>
+              <w:spacing w:before="80" w:after="80" w:line="276" w:lineRule="auto"/>
+              <w:jc w:val="both"/>
+            </w:pPr>
+            <w:r>
+              <w:rPr>
+                <w:sz w:val="18"/>
+                <w:szCs w:val="18"/>
+              </w:rPr>
+              <w:t>Displays a clean AI-generated summary of all uploaded documents — income overview, expense patterns, profit trends and key financial figures extracted automatically.</w:t>
             </w:r>
           </w:p>
         </w:tc>
       </w:tr>
       <w:tr>
-        <w:tblPrEx>
-          <w:tblCellMar>
-            <w:top w:w="0" w:type="dxa"/>
-            <w:bottom w:w="0" w:type="dxa"/>
-          </w:tblCellMar>
-        </w:tblPrEx>
         <w:tc>
           <w:tcPr>
             <w:tcW w:w="2380" w:type="dxa"/>
@@ -5112,7 +4970,7 @@
                 <w:sz w:val="18"/>
                 <w:szCs w:val="18"/>
               </w:rPr>
-              <w:t>AI Recommendations</w:t>
+              <w:t>Risk Analysis</w:t>
             </w:r>
           </w:p>
         </w:tc>
@@ -5125,36 +4983,30 @@
               <w:bottom w:val="single" w:sz="4" w:space="0" w:color="CCDDEE"/>
               <w:right w:val="single" w:sz="4" w:space="0" w:color="CCDDEE"/>
             </w:tcBorders>
-            <w:shd w:val="clear" w:color="auto" w:fill="FFFFFF"/>
-            <w:tcMar>
-              <w:top w:w="80" w:type="dxa"/>
-              <w:left w:w="120" w:type="dxa"/>
-              <w:bottom w:w="80" w:type="dxa"/>
-              <w:right w:w="120" w:type="dxa"/>
-            </w:tcMar>
-          </w:tcPr>
-          <w:p>
-            <w:pPr>
-              <w:spacing w:before="80" w:after="80" w:line="276" w:lineRule="auto"/>
-              <w:jc w:val="both"/>
-            </w:pPr>
-            <w:r>
-              <w:rPr>
-                <w:sz w:val="18"/>
-                <w:szCs w:val="18"/>
-              </w:rPr>
-              <w:t>Provides personalised guidance — credit improvement checklist, safer alternative options and specific actions the applicant can take to strengthen their financial profile.</w:t>
+            <w:shd w:val="clear" w:color="auto" w:fill="F2F8FF"/>
+            <w:tcMar>
+              <w:top w:w="80" w:type="dxa"/>
+              <w:left w:w="120" w:type="dxa"/>
+              <w:bottom w:w="80" w:type="dxa"/>
+              <w:right w:w="120" w:type="dxa"/>
+            </w:tcMar>
+          </w:tcPr>
+          <w:p>
+            <w:pPr>
+              <w:spacing w:before="80" w:after="80" w:line="276" w:lineRule="auto"/>
+              <w:jc w:val="both"/>
+            </w:pPr>
+            <w:r>
+              <w:rPr>
+                <w:sz w:val="18"/>
+                <w:szCs w:val="18"/>
+              </w:rPr>
+              <w:t>The core analysis page showing a visual risk score gauge (0-100) with Low, Moderate and High levels; a Risk Breakdown bar chart summarising Strengths, Weaknesses, Red Flags and Missing Information; a warning banner when concerns outweigh positives; and four detailed tabs — Strengths, Weaknesses, Red Flags and Missing Info — each listing specific findings extracted directly from the uploaded financial documents. Financial Institution users also see additional indicators here, such as debt-to-income ratio and fraud red-flags. All findings are fully grounded in the actual uploaded documents — no assumptions or guesswork involved.</w:t>
             </w:r>
           </w:p>
         </w:tc>
       </w:tr>
       <w:tr>
-        <w:tblPrEx>
-          <w:tblCellMar>
-            <w:top w:w="0" w:type="dxa"/>
-            <w:bottom w:w="0" w:type="dxa"/>
-          </w:tblCellMar>
-        </w:tblPrEx>
         <w:tc>
           <w:tcPr>
             <w:tcW w:w="2380" w:type="dxa"/>
@@ -5185,7 +5037,73 @@
                 <w:sz w:val="18"/>
                 <w:szCs w:val="18"/>
               </w:rPr>
-              <w:lastRenderedPageBreak/>
+              <w:t>AI Recommendations</w:t>
+            </w:r>
+          </w:p>
+        </w:tc>
+        <w:tc>
+          <w:tcPr>
+            <w:tcW w:w="7032" w:type="dxa"/>
+            <w:tcBorders>
+              <w:top w:val="single" w:sz="4" w:space="0" w:color="CCDDEE"/>
+              <w:left w:val="single" w:sz="4" w:space="0" w:color="CCDDEE"/>
+              <w:bottom w:val="single" w:sz="4" w:space="0" w:color="CCDDEE"/>
+              <w:right w:val="single" w:sz="4" w:space="0" w:color="CCDDEE"/>
+            </w:tcBorders>
+            <w:shd w:val="clear" w:color="auto" w:fill="FFFFFF"/>
+            <w:tcMar>
+              <w:top w:w="80" w:type="dxa"/>
+              <w:left w:w="120" w:type="dxa"/>
+              <w:bottom w:w="80" w:type="dxa"/>
+              <w:right w:w="120" w:type="dxa"/>
+            </w:tcMar>
+          </w:tcPr>
+          <w:p>
+            <w:pPr>
+              <w:spacing w:before="80" w:after="80" w:line="276" w:lineRule="auto"/>
+              <w:jc w:val="both"/>
+            </w:pPr>
+            <w:r>
+              <w:rPr>
+                <w:sz w:val="18"/>
+                <w:szCs w:val="18"/>
+              </w:rPr>
+              <w:t>Provides personalised guidance — credit improvement checklist, safer alternative options and specific actions the applicant can take to strengthen their financial profile. Financial Institution users see this as a structured Approve / Review / Reject recommendation with reasons.</w:t>
+            </w:r>
+          </w:p>
+        </w:tc>
+      </w:tr>
+      <w:tr>
+        <w:tc>
+          <w:tcPr>
+            <w:tcW w:w="2380" w:type="dxa"/>
+            <w:tcBorders>
+              <w:top w:val="single" w:sz="4" w:space="0" w:color="CCDDEE"/>
+              <w:left w:val="single" w:sz="4" w:space="0" w:color="CCDDEE"/>
+              <w:bottom w:val="single" w:sz="4" w:space="0" w:color="CCDDEE"/>
+              <w:right w:val="single" w:sz="4" w:space="0" w:color="CCDDEE"/>
+            </w:tcBorders>
+            <w:shd w:val="clear" w:color="auto" w:fill="1A6BB5"/>
+            <w:tcMar>
+              <w:top w:w="80" w:type="dxa"/>
+              <w:left w:w="120" w:type="dxa"/>
+              <w:bottom w:w="80" w:type="dxa"/>
+              <w:right w:w="120" w:type="dxa"/>
+            </w:tcMar>
+          </w:tcPr>
+          <w:p>
+            <w:pPr>
+              <w:spacing w:before="80" w:after="80" w:line="276" w:lineRule="auto"/>
+              <w:jc w:val="both"/>
+            </w:pPr>
+            <w:r>
+              <w:rPr>
+                <w:b/>
+                <w:bCs/>
+                <w:color w:val="FFFFFF"/>
+                <w:sz w:val="18"/>
+                <w:szCs w:val="18"/>
+              </w:rPr>
               <w:t>AI Chat</w:t>
             </w:r>
           </w:p>
@@ -5217,7 +5135,74 @@
                 <w:sz w:val="18"/>
                 <w:szCs w:val="18"/>
               </w:rPr>
-              <w:t>A conversational assistant where both the analyst and applicant can ask any question about the uploaded documents and receive answers grounded entirely in the actual financial data.</w:t>
+              <w:t>A conversational assistant where both the bank officer and applicant can ask any question about the uploaded documents and receive answers grounded entirely in the actual financial data.</w:t>
+            </w:r>
+          </w:p>
+        </w:tc>
+      </w:tr>
+      <w:tr>
+        <w:tc>
+          <w:tcPr>
+            <w:tcW w:w="2380" w:type="dxa"/>
+            <w:tcBorders>
+              <w:top w:val="single" w:sz="4" w:space="0" w:color="CCDDEE"/>
+              <w:left w:val="single" w:sz="4" w:space="0" w:color="CCDDEE"/>
+              <w:bottom w:val="single" w:sz="4" w:space="0" w:color="CCDDEE"/>
+              <w:right w:val="single" w:sz="4" w:space="0" w:color="CCDDEE"/>
+            </w:tcBorders>
+            <w:shd w:val="clear" w:color="auto" w:fill="1A6BB5"/>
+            <w:tcMar>
+              <w:top w:w="80" w:type="dxa"/>
+              <w:left w:w="120" w:type="dxa"/>
+              <w:bottom w:w="80" w:type="dxa"/>
+              <w:right w:w="120" w:type="dxa"/>
+            </w:tcMar>
+          </w:tcPr>
+          <w:p>
+            <w:pPr>
+              <w:spacing w:before="80" w:after="80" w:line="276" w:lineRule="auto"/>
+              <w:jc w:val="both"/>
+            </w:pPr>
+            <w:r>
+              <w:rPr>
+                <w:b/>
+                <w:bCs/>
+                <w:color w:val="FFFFFF"/>
+                <w:sz w:val="18"/>
+                <w:szCs w:val="18"/>
+              </w:rPr>
+              <w:t>Retirement Planner</w:t>
+            </w:r>
+          </w:p>
+        </w:tc>
+        <w:tc>
+          <w:tcPr>
+            <w:tcW w:w="7032" w:type="dxa"/>
+            <w:tcBorders>
+              <w:top w:val="single" w:sz="4" w:space="0" w:color="CCDDEE"/>
+              <w:left w:val="single" w:sz="4" w:space="0" w:color="CCDDEE"/>
+              <w:bottom w:val="single" w:sz="4" w:space="0" w:color="CCDDEE"/>
+              <w:right w:val="single" w:sz="4" w:space="0" w:color="CCDDEE"/>
+            </w:tcBorders>
+            <w:shd w:val="clear" w:color="auto" w:fill="FFFFFF"/>
+            <w:tcMar>
+              <w:top w:w="80" w:type="dxa"/>
+              <w:left w:w="120" w:type="dxa"/>
+              <w:bottom w:w="80" w:type="dxa"/>
+              <w:right w:w="120" w:type="dxa"/>
+            </w:tcMar>
+          </w:tcPr>
+          <w:p>
+            <w:pPr>
+              <w:spacing w:before="80" w:after="80" w:line="276" w:lineRule="auto"/>
+              <w:jc w:val="both"/>
+            </w:pPr>
+            <w:r>
+              <w:rPr>
+                <w:sz w:val="18"/>
+                <w:szCs w:val="18"/>
+              </w:rPr>
+              <w:t>A calculator for Customers that works out the retirement savings needed based on their city's cost of living, and the monthly savings required to reach that goal.</w:t>
             </w:r>
           </w:p>
         </w:tc>
@@ -5263,12 +5248,6 @@
         <w:gridCol w:w="6092"/>
       </w:tblGrid>
       <w:tr>
-        <w:tblPrEx>
-          <w:tblCellMar>
-            <w:top w:w="0" w:type="dxa"/>
-            <w:bottom w:w="0" w:type="dxa"/>
-          </w:tblCellMar>
-        </w:tblPrEx>
         <w:tc>
           <w:tcPr>
             <w:tcW w:w="620" w:type="dxa"/>
@@ -5332,7 +5311,7 @@
                 <w:b/>
                 <w:bCs/>
               </w:rPr>
-              <w:t>Upload Documents</w:t>
+              <w:t>Login / Register</w:t>
             </w:r>
           </w:p>
         </w:tc>
@@ -5360,18 +5339,12 @@
               <w:jc w:val="both"/>
             </w:pPr>
             <w:r>
-              <w:t>The user uploads their financial files.</w:t>
+              <w:t>The user signs in securely as either a Customer or a Financial Institution.</w:t>
             </w:r>
           </w:p>
         </w:tc>
       </w:tr>
       <w:tr>
-        <w:tblPrEx>
-          <w:tblCellMar>
-            <w:top w:w="0" w:type="dxa"/>
-            <w:bottom w:w="0" w:type="dxa"/>
-          </w:tblCellMar>
-        </w:tblPrEx>
         <w:tc>
           <w:tcPr>
             <w:tcW w:w="620" w:type="dxa"/>
@@ -5416,7 +5389,7 @@
               <w:bottom w:val="single" w:sz="4" w:space="0" w:color="CCDDEE"/>
               <w:right w:val="single" w:sz="4" w:space="0" w:color="CCDDEE"/>
             </w:tcBorders>
-            <w:shd w:val="clear" w:color="auto" w:fill="F2F8FF"/>
+            <w:shd w:val="clear" w:color="auto" w:fill="FFFFFF"/>
             <w:tcMar>
               <w:top w:w="100" w:type="dxa"/>
               <w:left w:w="120" w:type="dxa"/>
@@ -5435,7 +5408,7 @@
                 <w:b/>
                 <w:bCs/>
               </w:rPr>
-              <w:t>AI Reads Documents</w:t>
+              <w:t>Upload Documents</w:t>
             </w:r>
           </w:p>
         </w:tc>
@@ -5448,7 +5421,7 @@
               <w:bottom w:val="single" w:sz="4" w:space="0" w:color="CCDDEE"/>
               <w:right w:val="single" w:sz="4" w:space="0" w:color="CCDDEE"/>
             </w:tcBorders>
-            <w:shd w:val="clear" w:color="auto" w:fill="F2F8FF"/>
+            <w:shd w:val="clear" w:color="auto" w:fill="FFFFFF"/>
             <w:tcMar>
               <w:top w:w="100" w:type="dxa"/>
               <w:left w:w="120" w:type="dxa"/>
@@ -5463,18 +5436,12 @@
               <w:jc w:val="both"/>
             </w:pPr>
             <w:r>
-              <w:t>The system processes the text and numbers.</w:t>
+              <w:t>The user uploads their financial files.</w:t>
             </w:r>
           </w:p>
         </w:tc>
       </w:tr>
       <w:tr>
-        <w:tblPrEx>
-          <w:tblCellMar>
-            <w:top w:w="0" w:type="dxa"/>
-            <w:bottom w:w="0" w:type="dxa"/>
-          </w:tblCellMar>
-        </w:tblPrEx>
         <w:tc>
           <w:tcPr>
             <w:tcW w:w="620" w:type="dxa"/>
@@ -5519,7 +5486,7 @@
               <w:bottom w:val="single" w:sz="4" w:space="0" w:color="CCDDEE"/>
               <w:right w:val="single" w:sz="4" w:space="0" w:color="CCDDEE"/>
             </w:tcBorders>
-            <w:shd w:val="clear" w:color="auto" w:fill="FFFFFF"/>
+            <w:shd w:val="clear" w:color="auto" w:fill="F2F8FF"/>
             <w:tcMar>
               <w:top w:w="100" w:type="dxa"/>
               <w:left w:w="120" w:type="dxa"/>
@@ -5538,7 +5505,7 @@
                 <w:b/>
                 <w:bCs/>
               </w:rPr>
-              <w:t>Information Retrieved</w:t>
+              <w:t>AI Reads Documents</w:t>
             </w:r>
           </w:p>
         </w:tc>
@@ -5551,7 +5518,7 @@
               <w:bottom w:val="single" w:sz="4" w:space="0" w:color="CCDDEE"/>
               <w:right w:val="single" w:sz="4" w:space="0" w:color="CCDDEE"/>
             </w:tcBorders>
-            <w:shd w:val="clear" w:color="auto" w:fill="FFFFFF"/>
+            <w:shd w:val="clear" w:color="auto" w:fill="F2F8FF"/>
             <w:tcMar>
               <w:top w:w="100" w:type="dxa"/>
               <w:left w:w="120" w:type="dxa"/>
@@ -5566,18 +5533,12 @@
               <w:jc w:val="both"/>
             </w:pPr>
             <w:r>
-              <w:t>Key financial data points are extracted.</w:t>
+              <w:t>The system processes the text and numbers.</w:t>
             </w:r>
           </w:p>
         </w:tc>
       </w:tr>
       <w:tr>
-        <w:tblPrEx>
-          <w:tblCellMar>
-            <w:top w:w="0" w:type="dxa"/>
-            <w:bottom w:w="0" w:type="dxa"/>
-          </w:tblCellMar>
-        </w:tblPrEx>
         <w:tc>
           <w:tcPr>
             <w:tcW w:w="620" w:type="dxa"/>
@@ -5622,7 +5583,7 @@
               <w:bottom w:val="single" w:sz="4" w:space="0" w:color="CCDDEE"/>
               <w:right w:val="single" w:sz="4" w:space="0" w:color="CCDDEE"/>
             </w:tcBorders>
-            <w:shd w:val="clear" w:color="auto" w:fill="F2F8FF"/>
+            <w:shd w:val="clear" w:color="auto" w:fill="FFFFFF"/>
             <w:tcMar>
               <w:top w:w="100" w:type="dxa"/>
               <w:left w:w="120" w:type="dxa"/>
@@ -5641,7 +5602,7 @@
                 <w:b/>
                 <w:bCs/>
               </w:rPr>
-              <w:t>Risk Summary Generated</w:t>
+              <w:t>Information Retrieved</w:t>
             </w:r>
           </w:p>
         </w:tc>
@@ -5654,7 +5615,7 @@
               <w:bottom w:val="single" w:sz="4" w:space="0" w:color="CCDDEE"/>
               <w:right w:val="single" w:sz="4" w:space="0" w:color="CCDDEE"/>
             </w:tcBorders>
-            <w:shd w:val="clear" w:color="auto" w:fill="F2F8FF"/>
+            <w:shd w:val="clear" w:color="auto" w:fill="FFFFFF"/>
             <w:tcMar>
               <w:top w:w="100" w:type="dxa"/>
               <w:left w:w="120" w:type="dxa"/>
@@ -5669,18 +5630,12 @@
               <w:jc w:val="both"/>
             </w:pPr>
             <w:r>
-              <w:t>The platform generates an overview and suggests next steps.</w:t>
+              <w:t>Key financial data points are extracted.</w:t>
             </w:r>
           </w:p>
         </w:tc>
       </w:tr>
       <w:tr>
-        <w:tblPrEx>
-          <w:tblCellMar>
-            <w:top w:w="0" w:type="dxa"/>
-            <w:bottom w:w="0" w:type="dxa"/>
-          </w:tblCellMar>
-        </w:tblPrEx>
         <w:tc>
           <w:tcPr>
             <w:tcW w:w="620" w:type="dxa"/>
@@ -5725,7 +5680,7 @@
               <w:bottom w:val="single" w:sz="4" w:space="0" w:color="CCDDEE"/>
               <w:right w:val="single" w:sz="4" w:space="0" w:color="CCDDEE"/>
             </w:tcBorders>
-            <w:shd w:val="clear" w:color="auto" w:fill="FFFFFF"/>
+            <w:shd w:val="clear" w:color="auto" w:fill="F2F8FF"/>
             <w:tcMar>
               <w:top w:w="100" w:type="dxa"/>
               <w:left w:w="120" w:type="dxa"/>
@@ -5744,7 +5699,7 @@
                 <w:b/>
                 <w:bCs/>
               </w:rPr>
-              <w:t>Verification</w:t>
+              <w:t>Risk Summary Generated</w:t>
             </w:r>
           </w:p>
         </w:tc>
@@ -5757,7 +5712,7 @@
               <w:bottom w:val="single" w:sz="4" w:space="0" w:color="CCDDEE"/>
               <w:right w:val="single" w:sz="4" w:space="0" w:color="CCDDEE"/>
             </w:tcBorders>
-            <w:shd w:val="clear" w:color="auto" w:fill="FFFFFF"/>
+            <w:shd w:val="clear" w:color="auto" w:fill="F2F8FF"/>
             <w:tcMar>
               <w:top w:w="100" w:type="dxa"/>
               <w:left w:w="120" w:type="dxa"/>
@@ -5772,18 +5727,12 @@
               <w:jc w:val="both"/>
             </w:pPr>
             <w:r>
-              <w:t>A human reviews and signs off on the findings.</w:t>
+              <w:t>The platform generates an overview and suggests next steps.</w:t>
             </w:r>
           </w:p>
         </w:tc>
       </w:tr>
       <w:tr>
-        <w:tblPrEx>
-          <w:tblCellMar>
-            <w:top w:w="0" w:type="dxa"/>
-            <w:bottom w:w="0" w:type="dxa"/>
-          </w:tblCellMar>
-        </w:tblPrEx>
         <w:tc>
           <w:tcPr>
             <w:tcW w:w="620" w:type="dxa"/>
@@ -5816,6 +5765,103 @@
                 <w:szCs w:val="24"/>
               </w:rPr>
               <w:t>6</w:t>
+            </w:r>
+          </w:p>
+        </w:tc>
+        <w:tc>
+          <w:tcPr>
+            <w:tcW w:w="2700" w:type="dxa"/>
+            <w:tcBorders>
+              <w:top w:val="single" w:sz="4" w:space="0" w:color="CCDDEE"/>
+              <w:left w:val="single" w:sz="4" w:space="0" w:color="CCDDEE"/>
+              <w:bottom w:val="single" w:sz="4" w:space="0" w:color="CCDDEE"/>
+              <w:right w:val="single" w:sz="4" w:space="0" w:color="CCDDEE"/>
+            </w:tcBorders>
+            <w:shd w:val="clear" w:color="auto" w:fill="FFFFFF"/>
+            <w:tcMar>
+              <w:top w:w="100" w:type="dxa"/>
+              <w:left w:w="120" w:type="dxa"/>
+              <w:bottom w:w="100" w:type="dxa"/>
+              <w:right w:w="120" w:type="dxa"/>
+            </w:tcMar>
+            <w:vAlign w:val="center"/>
+          </w:tcPr>
+          <w:p>
+            <w:pPr>
+              <w:spacing w:before="80" w:after="80" w:line="276" w:lineRule="auto"/>
+              <w:jc w:val="both"/>
+            </w:pPr>
+            <w:r>
+              <w:rPr>
+                <w:b/>
+                <w:bCs/>
+              </w:rPr>
+              <w:t>Verification</w:t>
+            </w:r>
+          </w:p>
+        </w:tc>
+        <w:tc>
+          <w:tcPr>
+            <w:tcW w:w="6092" w:type="dxa"/>
+            <w:tcBorders>
+              <w:top w:val="single" w:sz="4" w:space="0" w:color="CCDDEE"/>
+              <w:left w:val="single" w:sz="4" w:space="0" w:color="CCDDEE"/>
+              <w:bottom w:val="single" w:sz="4" w:space="0" w:color="CCDDEE"/>
+              <w:right w:val="single" w:sz="4" w:space="0" w:color="CCDDEE"/>
+            </w:tcBorders>
+            <w:shd w:val="clear" w:color="auto" w:fill="FFFFFF"/>
+            <w:tcMar>
+              <w:top w:w="100" w:type="dxa"/>
+              <w:left w:w="120" w:type="dxa"/>
+              <w:bottom w:w="100" w:type="dxa"/>
+              <w:right w:w="120" w:type="dxa"/>
+            </w:tcMar>
+            <w:vAlign w:val="center"/>
+          </w:tcPr>
+          <w:p>
+            <w:pPr>
+              <w:spacing w:before="80" w:after="80" w:line="276" w:lineRule="auto"/>
+              <w:jc w:val="both"/>
+            </w:pPr>
+            <w:r>
+              <w:t>A human analyst reviews and signs off on the findings before any loan decision is finalised.</w:t>
+            </w:r>
+          </w:p>
+        </w:tc>
+      </w:tr>
+      <w:tr>
+        <w:tc>
+          <w:tcPr>
+            <w:tcW w:w="620" w:type="dxa"/>
+            <w:tcBorders>
+              <w:top w:val="single" w:sz="4" w:space="0" w:color="CCDDEE"/>
+              <w:left w:val="single" w:sz="4" w:space="0" w:color="CCDDEE"/>
+              <w:bottom w:val="single" w:sz="4" w:space="0" w:color="CCDDEE"/>
+              <w:right w:val="single" w:sz="4" w:space="0" w:color="CCDDEE"/>
+            </w:tcBorders>
+            <w:shd w:val="clear" w:color="auto" w:fill="1A6BB5"/>
+            <w:tcMar>
+              <w:top w:w="100" w:type="dxa"/>
+              <w:left w:w="80" w:type="dxa"/>
+              <w:bottom w:w="100" w:type="dxa"/>
+              <w:right w:w="80" w:type="dxa"/>
+            </w:tcMar>
+            <w:vAlign w:val="center"/>
+          </w:tcPr>
+          <w:p>
+            <w:pPr>
+              <w:spacing w:before="80" w:after="80" w:line="276" w:lineRule="auto"/>
+              <w:jc w:val="center"/>
+            </w:pPr>
+            <w:r>
+              <w:rPr>
+                <w:b/>
+                <w:bCs/>
+                <w:color w:val="FFFFFF"/>
+                <w:sz w:val="24"/>
+                <w:szCs w:val="24"/>
+              </w:rPr>
+              <w:t>7</w:t>
             </w:r>
           </w:p>
         </w:tc>
@@ -5912,6 +5958,7 @@
           <w:b/>
           <w:bCs/>
         </w:rPr>
+        <w:lastRenderedPageBreak/>
         <w:t xml:space="preserve">Build Future Client Pipelines: </w:t>
       </w:r>
       <w:r>
@@ -6019,13 +6066,8 @@
       <w:pPr>
         <w:pStyle w:val="Heading2"/>
       </w:pPr>
-      <w:proofErr w:type="gramStart"/>
-      <w:r>
-        <w:t>9.1  Multi</w:t>
-      </w:r>
-      <w:proofErr w:type="gramEnd"/>
-      <w:r>
-        <w:t>-Agent Architecture</w:t>
+      <w:r>
+        <w:t>9.1  Multi-Agent Architecture</w:t>
       </w:r>
     </w:p>
     <w:p>
@@ -6034,7 +6076,7 @@
         <w:jc w:val="both"/>
       </w:pPr>
       <w:r>
-        <w:t>The platform uses four specialist AI agents, each handling a specific part of the credit risk analysis. All four agents are coordinated by a central Orchestrator that decides which agent to call and in what order.</w:t>
+        <w:t>The platform uses three specialist AI agents, each handling a specific part of the credit risk analysis. All three agents are coordinated by a central Orchestrator that decides which agent to call and in what order. After the agents respond, an AI cross-check step verifies every answer against the original source documents before it is shown to the user.</w:t>
       </w:r>
     </w:p>
     <w:p>
@@ -6065,12 +6107,6 @@
         <w:gridCol w:w="7252"/>
       </w:tblGrid>
       <w:tr>
-        <w:tblPrEx>
-          <w:tblCellMar>
-            <w:top w:w="0" w:type="dxa"/>
-            <w:bottom w:w="0" w:type="dxa"/>
-          </w:tblCellMar>
-        </w:tblPrEx>
         <w:tc>
           <w:tcPr>
             <w:tcW w:w="2160" w:type="dxa"/>
@@ -6138,12 +6174,6 @@
         </w:tc>
       </w:tr>
       <w:tr>
-        <w:tblPrEx>
-          <w:tblCellMar>
-            <w:top w:w="0" w:type="dxa"/>
-            <w:bottom w:w="0" w:type="dxa"/>
-          </w:tblCellMar>
-        </w:tblPrEx>
         <w:tc>
           <w:tcPr>
             <w:tcW w:w="2160" w:type="dxa"/>
@@ -6174,7 +6204,6 @@
                 <w:sz w:val="18"/>
                 <w:szCs w:val="18"/>
               </w:rPr>
-              <w:lastRenderedPageBreak/>
               <w:t>Retrieval Agent</w:t>
             </w:r>
           </w:p>
@@ -6212,12 +6241,6 @@
         </w:tc>
       </w:tr>
       <w:tr>
-        <w:tblPrEx>
-          <w:tblCellMar>
-            <w:top w:w="0" w:type="dxa"/>
-            <w:bottom w:w="0" w:type="dxa"/>
-          </w:tblCellMar>
-        </w:tblPrEx>
         <w:tc>
           <w:tcPr>
             <w:tcW w:w="2160" w:type="dxa"/>
@@ -6248,7 +6271,7 @@
                 <w:sz w:val="18"/>
                 <w:szCs w:val="18"/>
               </w:rPr>
-              <w:t>Reasoning Agent</w:t>
+              <w:t>Document Agent</w:t>
             </w:r>
           </w:p>
         </w:tc>
@@ -6279,18 +6302,12 @@
                 <w:sz w:val="18"/>
                 <w:szCs w:val="18"/>
               </w:rPr>
-              <w:t>Takes the retrieved financial data and analyses it to compute a complete credit risk score from 0 to 100. It identifies strengths in the applicant's financial profile, flags weaknesses, highlights serious red flags like missed payments or high debt, and notes any missing information that the bank should request.</w:t>
+              <w:t>Reads through all uploaded documents and produces a clean, concise financial overview — condensing everything into a structured summary covering income, expenses, profit trends, assets and liabilities, so the analyst doesn't need to read every page.</w:t>
             </w:r>
           </w:p>
         </w:tc>
       </w:tr>
       <w:tr>
-        <w:tblPrEx>
-          <w:tblCellMar>
-            <w:top w:w="0" w:type="dxa"/>
-            <w:bottom w:w="0" w:type="dxa"/>
-          </w:tblCellMar>
-        </w:tblPrEx>
         <w:tc>
           <w:tcPr>
             <w:tcW w:w="2160" w:type="dxa"/>
@@ -6321,7 +6338,7 @@
                 <w:sz w:val="18"/>
                 <w:szCs w:val="18"/>
               </w:rPr>
-              <w:t>Summariser Agent</w:t>
+              <w:t>Chat Agent</w:t>
             </w:r>
           </w:p>
         </w:tc>
@@ -6352,80 +6369,7 @@
                 <w:sz w:val="18"/>
                 <w:szCs w:val="18"/>
               </w:rPr>
-              <w:t>Reads through all uploaded documents and produces a clean, concise financial overview. Instead of the analyst reading hundreds of pages, this agent condenses everything into a structured summary covering income, expenses, profit trends, assets and liabilities.</w:t>
-            </w:r>
-          </w:p>
-        </w:tc>
-      </w:tr>
-      <w:tr>
-        <w:tblPrEx>
-          <w:tblCellMar>
-            <w:top w:w="0" w:type="dxa"/>
-            <w:bottom w:w="0" w:type="dxa"/>
-          </w:tblCellMar>
-        </w:tblPrEx>
-        <w:tc>
-          <w:tcPr>
-            <w:tcW w:w="2160" w:type="dxa"/>
-            <w:tcBorders>
-              <w:top w:val="single" w:sz="4" w:space="0" w:color="CCDDEE"/>
-              <w:left w:val="single" w:sz="4" w:space="0" w:color="CCDDEE"/>
-              <w:bottom w:val="single" w:sz="4" w:space="0" w:color="CCDDEE"/>
-              <w:right w:val="single" w:sz="4" w:space="0" w:color="CCDDEE"/>
-            </w:tcBorders>
-            <w:shd w:val="clear" w:color="auto" w:fill="0D1B2A"/>
-            <w:tcMar>
-              <w:top w:w="80" w:type="dxa"/>
-              <w:left w:w="120" w:type="dxa"/>
-              <w:bottom w:w="80" w:type="dxa"/>
-              <w:right w:w="120" w:type="dxa"/>
-            </w:tcMar>
-          </w:tcPr>
-          <w:p>
-            <w:pPr>
-              <w:spacing w:before="80" w:after="80" w:line="276" w:lineRule="auto"/>
-              <w:jc w:val="both"/>
-            </w:pPr>
-            <w:r>
-              <w:rPr>
-                <w:b/>
-                <w:bCs/>
-                <w:color w:val="FFFFFF"/>
-                <w:sz w:val="18"/>
-                <w:szCs w:val="18"/>
-              </w:rPr>
-              <w:t>Recommender Agent</w:t>
-            </w:r>
-          </w:p>
-        </w:tc>
-        <w:tc>
-          <w:tcPr>
-            <w:tcW w:w="7252" w:type="dxa"/>
-            <w:tcBorders>
-              <w:top w:val="single" w:sz="4" w:space="0" w:color="CCDDEE"/>
-              <w:left w:val="single" w:sz="4" w:space="0" w:color="CCDDEE"/>
-              <w:bottom w:val="single" w:sz="4" w:space="0" w:color="CCDDEE"/>
-              <w:right w:val="single" w:sz="4" w:space="0" w:color="CCDDEE"/>
-            </w:tcBorders>
-            <w:shd w:val="clear" w:color="auto" w:fill="FFFFFF"/>
-            <w:tcMar>
-              <w:top w:w="80" w:type="dxa"/>
-              <w:left w:w="120" w:type="dxa"/>
-              <w:bottom w:w="80" w:type="dxa"/>
-              <w:right w:w="120" w:type="dxa"/>
-            </w:tcMar>
-          </w:tcPr>
-          <w:p>
-            <w:pPr>
-              <w:spacing w:before="80" w:after="80" w:line="276" w:lineRule="auto"/>
-              <w:jc w:val="both"/>
-            </w:pPr>
-            <w:r>
-              <w:rPr>
-                <w:sz w:val="18"/>
-                <w:szCs w:val="18"/>
-              </w:rPr>
-              <w:t>Based on the risk findings, this agent generates personalised guidance. It builds a step-by-step credit improvement checklist, suggests safer alternative options, and provides specific actions the applicant can take to strengthen their financial profile and improve their chances next time.</w:t>
+              <w:t>Answers any question asked on the AI Chat page and computes the credit risk score from 0 to 100 — identifying strengths, flagging weaknesses, highlighting red flags like missed payments or high debt, and generating the personalised recommendations shown to the user. Every answer stays grounded in the retrieved document evidence.</w:t>
             </w:r>
           </w:p>
         </w:tc>
@@ -6441,13 +6385,8 @@
       <w:pPr>
         <w:pStyle w:val="Heading2"/>
       </w:pPr>
-      <w:proofErr w:type="gramStart"/>
-      <w:r>
-        <w:t>9.2  Technology</w:t>
-      </w:r>
-      <w:proofErr w:type="gramEnd"/>
-      <w:r>
-        <w:t xml:space="preserve"> Stack</w:t>
+      <w:r>
+        <w:t>9.2  Technology Stack</w:t>
       </w:r>
     </w:p>
     <w:tbl>
@@ -6473,12 +6412,6 @@
         <w:gridCol w:w="4652"/>
       </w:tblGrid>
       <w:tr>
-        <w:tblPrEx>
-          <w:tblCellMar>
-            <w:top w:w="0" w:type="dxa"/>
-            <w:bottom w:w="0" w:type="dxa"/>
-          </w:tblCellMar>
-        </w:tblPrEx>
         <w:trPr>
           <w:tblHeader/>
         </w:trPr>
@@ -6589,12 +6522,6 @@
         </w:tc>
       </w:tr>
       <w:tr>
-        <w:tblPrEx>
-          <w:tblCellMar>
-            <w:top w:w="0" w:type="dxa"/>
-            <w:bottom w:w="0" w:type="dxa"/>
-          </w:tblCellMar>
-        </w:tblPrEx>
         <w:tc>
           <w:tcPr>
             <w:tcW w:w="2240" w:type="dxa"/>
@@ -6648,7 +6575,6 @@
               <w:spacing w:before="80" w:after="80" w:line="276" w:lineRule="auto"/>
               <w:jc w:val="both"/>
             </w:pPr>
-            <w:proofErr w:type="spellStart"/>
             <w:r>
               <w:rPr>
                 <w:sz w:val="18"/>
@@ -6656,7 +6582,6 @@
               </w:rPr>
               <w:t>Streamlit</w:t>
             </w:r>
-            <w:proofErr w:type="spellEnd"/>
           </w:p>
         </w:tc>
         <w:tc>
@@ -6692,12 +6617,6 @@
         </w:tc>
       </w:tr>
       <w:tr>
-        <w:tblPrEx>
-          <w:tblCellMar>
-            <w:top w:w="0" w:type="dxa"/>
-            <w:bottom w:w="0" w:type="dxa"/>
-          </w:tblCellMar>
-        </w:tblPrEx>
         <w:tc>
           <w:tcPr>
             <w:tcW w:w="2240" w:type="dxa"/>
@@ -6751,31 +6670,13 @@
               <w:spacing w:before="80" w:after="80" w:line="276" w:lineRule="auto"/>
               <w:jc w:val="both"/>
             </w:pPr>
-            <w:proofErr w:type="spellStart"/>
-            <w:r>
-              <w:rPr>
-                <w:sz w:val="18"/>
-                <w:szCs w:val="18"/>
-              </w:rPr>
-              <w:t>LangChain</w:t>
-            </w:r>
-            <w:proofErr w:type="spellEnd"/>
-            <w:r>
-              <w:rPr>
-                <w:sz w:val="18"/>
-                <w:szCs w:val="18"/>
-              </w:rPr>
-              <w:t xml:space="preserve"> + </w:t>
-            </w:r>
-            <w:proofErr w:type="spellStart"/>
-            <w:r>
-              <w:rPr>
-                <w:sz w:val="18"/>
-                <w:szCs w:val="18"/>
-              </w:rPr>
-              <w:t>LangGraph</w:t>
-            </w:r>
-            <w:proofErr w:type="spellEnd"/>
+            <w:r>
+              <w:rPr>
+                <w:sz w:val="18"/>
+                <w:szCs w:val="18"/>
+              </w:rPr>
+              <w:t>LangChain + LangGraph</w:t>
+            </w:r>
           </w:p>
         </w:tc>
         <w:tc>
@@ -6811,12 +6712,6 @@
         </w:tc>
       </w:tr>
       <w:tr>
-        <w:tblPrEx>
-          <w:tblCellMar>
-            <w:top w:w="0" w:type="dxa"/>
-            <w:bottom w:w="0" w:type="dxa"/>
-          </w:tblCellMar>
-        </w:tblPrEx>
         <w:tc>
           <w:tcPr>
             <w:tcW w:w="2240" w:type="dxa"/>
@@ -6844,6 +6739,7 @@
                 <w:sz w:val="18"/>
                 <w:szCs w:val="18"/>
               </w:rPr>
+              <w:lastRenderedPageBreak/>
               <w:t>LLM</w:t>
             </w:r>
           </w:p>
@@ -6875,7 +6771,21 @@
                 <w:sz w:val="18"/>
                 <w:szCs w:val="18"/>
               </w:rPr>
-              <w:t>Gemini 1.5 Pro (Primary) / OpenAI GPT-4o (Fallback)</w:t>
+              <w:t>OpenAI (Primary) → Groq (Secondary) → Gemini (</w:t>
+            </w:r>
+            <w:r>
+              <w:rPr>
+                <w:sz w:val="18"/>
+                <w:szCs w:val="18"/>
+              </w:rPr>
+              <w:t>Backup</w:t>
+            </w:r>
+            <w:r>
+              <w:rPr>
+                <w:sz w:val="18"/>
+                <w:szCs w:val="18"/>
+              </w:rPr>
+              <w:t>)</w:t>
             </w:r>
           </w:p>
         </w:tc>
@@ -6906,18 +6816,12 @@
                 <w:sz w:val="18"/>
                 <w:szCs w:val="18"/>
               </w:rPr>
-              <w:t>Powers all AI reasoning — document summarisation, risk scoring and recommendation generation.</w:t>
+              <w:t>Powers all AI reasoning — document summarisation, risk scoring and recommendation generation. If OpenAI is unavailable, the platform automatically falls back to Groq, then Gemini, so the service keeps running.</w:t>
             </w:r>
           </w:p>
         </w:tc>
       </w:tr>
       <w:tr>
-        <w:tblPrEx>
-          <w:tblCellMar>
-            <w:top w:w="0" w:type="dxa"/>
-            <w:bottom w:w="0" w:type="dxa"/>
-          </w:tblCellMar>
-        </w:tblPrEx>
         <w:tc>
           <w:tcPr>
             <w:tcW w:w="2240" w:type="dxa"/>
@@ -7013,12 +6917,6 @@
         </w:tc>
       </w:tr>
       <w:tr>
-        <w:tblPrEx>
-          <w:tblCellMar>
-            <w:top w:w="0" w:type="dxa"/>
-            <w:bottom w:w="0" w:type="dxa"/>
-          </w:tblCellMar>
-        </w:tblPrEx>
         <w:tc>
           <w:tcPr>
             <w:tcW w:w="2240" w:type="dxa"/>
@@ -7077,7 +6975,7 @@
                 <w:sz w:val="18"/>
                 <w:szCs w:val="18"/>
               </w:rPr>
-              <w:t>FAISS</w:t>
+              <w:t>Pinecone</w:t>
             </w:r>
           </w:p>
         </w:tc>
@@ -7108,18 +7006,12 @@
                 <w:sz w:val="18"/>
                 <w:szCs w:val="18"/>
               </w:rPr>
-              <w:t>Stores all embedded vectors locally and enables fast similarity search for the RAG pipeline.</w:t>
+              <w:t>Stores embedded vectors in the cloud and enables fast similarity search for the RAG pipeline. Combined with BM25 keyword search and year-aware re-ranking to keep retrieved facts accurate and current.</w:t>
             </w:r>
           </w:p>
         </w:tc>
       </w:tr>
       <w:tr>
-        <w:tblPrEx>
-          <w:tblCellMar>
-            <w:top w:w="0" w:type="dxa"/>
-            <w:bottom w:w="0" w:type="dxa"/>
-          </w:tblCellMar>
-        </w:tblPrEx>
         <w:tc>
           <w:tcPr>
             <w:tcW w:w="2240" w:type="dxa"/>
@@ -7173,31 +7065,13 @@
               <w:spacing w:before="80" w:after="80" w:line="276" w:lineRule="auto"/>
               <w:jc w:val="both"/>
             </w:pPr>
-            <w:proofErr w:type="spellStart"/>
-            <w:r>
-              <w:rPr>
-                <w:sz w:val="18"/>
-                <w:szCs w:val="18"/>
-              </w:rPr>
-              <w:t>PyMuPDF</w:t>
-            </w:r>
-            <w:proofErr w:type="spellEnd"/>
-            <w:r>
-              <w:rPr>
-                <w:sz w:val="18"/>
-                <w:szCs w:val="18"/>
-              </w:rPr>
-              <w:t xml:space="preserve"> + </w:t>
-            </w:r>
-            <w:proofErr w:type="spellStart"/>
-            <w:r>
-              <w:rPr>
-                <w:sz w:val="18"/>
-                <w:szCs w:val="18"/>
-              </w:rPr>
-              <w:t>pypdf</w:t>
-            </w:r>
-            <w:proofErr w:type="spellEnd"/>
+            <w:r>
+              <w:rPr>
+                <w:sz w:val="18"/>
+                <w:szCs w:val="18"/>
+              </w:rPr>
+              <w:t>PyMuPDF + pypdf</w:t>
+            </w:r>
           </w:p>
         </w:tc>
         <w:tc>
@@ -7233,12 +7107,6 @@
         </w:tc>
       </w:tr>
       <w:tr>
-        <w:tblPrEx>
-          <w:tblCellMar>
-            <w:top w:w="0" w:type="dxa"/>
-            <w:bottom w:w="0" w:type="dxa"/>
-          </w:tblCellMar>
-        </w:tblPrEx>
         <w:tc>
           <w:tcPr>
             <w:tcW w:w="2240" w:type="dxa"/>
@@ -7334,12 +7202,6 @@
         </w:tc>
       </w:tr>
       <w:tr>
-        <w:tblPrEx>
-          <w:tblCellMar>
-            <w:top w:w="0" w:type="dxa"/>
-            <w:bottom w:w="0" w:type="dxa"/>
-          </w:tblCellMar>
-        </w:tblPrEx>
         <w:tc>
           <w:tcPr>
             <w:tcW w:w="2240" w:type="dxa"/>
@@ -7393,21 +7255,12 @@
               <w:spacing w:before="80" w:after="80" w:line="276" w:lineRule="auto"/>
               <w:jc w:val="both"/>
             </w:pPr>
-            <w:proofErr w:type="spellStart"/>
-            <w:r>
-              <w:rPr>
-                <w:sz w:val="18"/>
-                <w:szCs w:val="18"/>
-              </w:rPr>
-              <w:t>LangChain</w:t>
-            </w:r>
-            <w:proofErr w:type="spellEnd"/>
-            <w:r>
-              <w:rPr>
-                <w:sz w:val="18"/>
-                <w:szCs w:val="18"/>
-              </w:rPr>
-              <w:t xml:space="preserve"> Text Splitter</w:t>
+            <w:r>
+              <w:rPr>
+                <w:sz w:val="18"/>
+                <w:szCs w:val="18"/>
+              </w:rPr>
+              <w:t>LangChain Text Splitter</w:t>
             </w:r>
           </w:p>
         </w:tc>
@@ -7444,12 +7297,6 @@
         </w:tc>
       </w:tr>
       <w:tr>
-        <w:tblPrEx>
-          <w:tblCellMar>
-            <w:top w:w="0" w:type="dxa"/>
-            <w:bottom w:w="0" w:type="dxa"/>
-          </w:tblCellMar>
-        </w:tblPrEx>
         <w:tc>
           <w:tcPr>
             <w:tcW w:w="2240" w:type="dxa"/>
@@ -7503,7 +7350,6 @@
               <w:spacing w:before="80" w:after="80" w:line="276" w:lineRule="auto"/>
               <w:jc w:val="both"/>
             </w:pPr>
-            <w:proofErr w:type="spellStart"/>
             <w:r>
               <w:rPr>
                 <w:sz w:val="18"/>
@@ -7511,7 +7357,6 @@
               </w:rPr>
               <w:t>LangSmith</w:t>
             </w:r>
-            <w:proofErr w:type="spellEnd"/>
           </w:p>
         </w:tc>
         <w:tc>
@@ -7547,12 +7392,6 @@
         </w:tc>
       </w:tr>
       <w:tr>
-        <w:tblPrEx>
-          <w:tblCellMar>
-            <w:top w:w="0" w:type="dxa"/>
-            <w:bottom w:w="0" w:type="dxa"/>
-          </w:tblCellMar>
-        </w:tblPrEx>
         <w:tc>
           <w:tcPr>
             <w:tcW w:w="2240" w:type="dxa"/>
@@ -7580,7 +7419,6 @@
                 <w:sz w:val="18"/>
                 <w:szCs w:val="18"/>
               </w:rPr>
-              <w:lastRenderedPageBreak/>
               <w:t>Evaluation</w:t>
             </w:r>
           </w:p>
@@ -7614,6 +7452,22 @@
               </w:rPr>
               <w:t>RAGAS</w:t>
             </w:r>
+            <w:r>
+              <w:rPr>
+                <w:sz w:val="18"/>
+                <w:szCs w:val="18"/>
+              </w:rPr>
+              <w:t xml:space="preserve"> + </w:t>
+            </w:r>
+            <w:proofErr w:type="spellStart"/>
+            <w:r>
+              <w:rPr>
+                <w:sz w:val="18"/>
+                <w:szCs w:val="18"/>
+              </w:rPr>
+              <w:t>DeepEval</w:t>
+            </w:r>
+            <w:proofErr w:type="spellEnd"/>
           </w:p>
         </w:tc>
         <w:tc>
@@ -7643,18 +7497,28 @@
                 <w:sz w:val="18"/>
                 <w:szCs w:val="18"/>
               </w:rPr>
-              <w:t>Measures AI answer quality — faithfulness, answer relevancy, context precision and context recall.</w:t>
+              <w:t xml:space="preserve">RAGAS + </w:t>
+            </w:r>
+            <w:proofErr w:type="spellStart"/>
+            <w:r>
+              <w:rPr>
+                <w:sz w:val="18"/>
+                <w:szCs w:val="18"/>
+              </w:rPr>
+              <w:t>DeepEval</w:t>
+            </w:r>
+            <w:proofErr w:type="spellEnd"/>
+            <w:r>
+              <w:rPr>
+                <w:sz w:val="18"/>
+                <w:szCs w:val="18"/>
+              </w:rPr>
+              <w:t xml:space="preserve"> – Measures RAG response quality using Faithfulness, Answer Relevancy, Context Precision, and Context Recall to evaluate accuracy, retrieval quality, and detect hallucinations.</w:t>
             </w:r>
           </w:p>
         </w:tc>
       </w:tr>
       <w:tr>
-        <w:tblPrEx>
-          <w:tblCellMar>
-            <w:top w:w="0" w:type="dxa"/>
-            <w:bottom w:w="0" w:type="dxa"/>
-          </w:tblCellMar>
-        </w:tblPrEx>
         <w:tc>
           <w:tcPr>
             <w:tcW w:w="2240" w:type="dxa"/>
@@ -7713,7 +7577,7 @@
                 <w:sz w:val="18"/>
                 <w:szCs w:val="18"/>
               </w:rPr>
-              <w:t>Azure Container Apps</w:t>
+              <w:t>Docker on Azure App Service (via Azure Container Registry)</w:t>
             </w:r>
           </w:p>
         </w:tc>
@@ -7744,18 +7608,12 @@
                 <w:sz w:val="18"/>
                 <w:szCs w:val="18"/>
               </w:rPr>
-              <w:t>Hosts and runs the platform in the cloud with automatic scaling.</w:t>
+              <w:t>Packages the platform as a Docker container, stores it in Azure Container Registry, and runs it on Azure App Service with automatic scaling.</w:t>
             </w:r>
           </w:p>
         </w:tc>
       </w:tr>
       <w:tr>
-        <w:tblPrEx>
-          <w:tblCellMar>
-            <w:top w:w="0" w:type="dxa"/>
-            <w:bottom w:w="0" w:type="dxa"/>
-          </w:tblCellMar>
-        </w:tblPrEx>
         <w:tc>
           <w:tcPr>
             <w:tcW w:w="2240" w:type="dxa"/>
@@ -7851,12 +7709,6 @@
         </w:tc>
       </w:tr>
       <w:tr>
-        <w:tblPrEx>
-          <w:tblCellMar>
-            <w:top w:w="0" w:type="dxa"/>
-            <w:bottom w:w="0" w:type="dxa"/>
-          </w:tblCellMar>
-        </w:tblPrEx>
         <w:tc>
           <w:tcPr>
             <w:tcW w:w="2240" w:type="dxa"/>
@@ -7947,6 +7799,196 @@
                 <w:szCs w:val="18"/>
               </w:rPr>
               <w:t>Manages all source code, branching and team collaboration.</w:t>
+            </w:r>
+          </w:p>
+        </w:tc>
+      </w:tr>
+      <w:tr>
+        <w:tc>
+          <w:tcPr>
+            <w:tcW w:w="2240" w:type="dxa"/>
+            <w:tcBorders>
+              <w:top w:val="single" w:sz="4" w:space="0" w:color="CCDDEE"/>
+              <w:left w:val="single" w:sz="4" w:space="0" w:color="CCDDEE"/>
+              <w:bottom w:val="single" w:sz="4" w:space="0" w:color="CCDDEE"/>
+              <w:right w:val="single" w:sz="4" w:space="0" w:color="CCDDEE"/>
+            </w:tcBorders>
+            <w:shd w:val="clear" w:color="auto" w:fill="F2F8FF"/>
+            <w:tcMar>
+              <w:top w:w="80" w:type="dxa"/>
+              <w:left w:w="120" w:type="dxa"/>
+              <w:bottom w:w="80" w:type="dxa"/>
+              <w:right w:w="120" w:type="dxa"/>
+            </w:tcMar>
+          </w:tcPr>
+          <w:p>
+            <w:pPr>
+              <w:spacing w:before="80" w:after="80" w:line="276" w:lineRule="auto"/>
+              <w:jc w:val="both"/>
+            </w:pPr>
+            <w:r>
+              <w:rPr>
+                <w:sz w:val="18"/>
+                <w:szCs w:val="18"/>
+              </w:rPr>
+              <w:t>Authentication</w:t>
+            </w:r>
+          </w:p>
+        </w:tc>
+        <w:tc>
+          <w:tcPr>
+            <w:tcW w:w="2520" w:type="dxa"/>
+            <w:tcBorders>
+              <w:top w:val="single" w:sz="4" w:space="0" w:color="CCDDEE"/>
+              <w:left w:val="single" w:sz="4" w:space="0" w:color="CCDDEE"/>
+              <w:bottom w:val="single" w:sz="4" w:space="0" w:color="CCDDEE"/>
+              <w:right w:val="single" w:sz="4" w:space="0" w:color="CCDDEE"/>
+            </w:tcBorders>
+            <w:shd w:val="clear" w:color="auto" w:fill="F2F8FF"/>
+            <w:tcMar>
+              <w:top w:w="80" w:type="dxa"/>
+              <w:left w:w="120" w:type="dxa"/>
+              <w:bottom w:w="80" w:type="dxa"/>
+              <w:right w:w="120" w:type="dxa"/>
+            </w:tcMar>
+          </w:tcPr>
+          <w:p>
+            <w:pPr>
+              <w:spacing w:before="80" w:after="80" w:line="276" w:lineRule="auto"/>
+              <w:jc w:val="both"/>
+            </w:pPr>
+            <w:r>
+              <w:rPr>
+                <w:sz w:val="18"/>
+                <w:szCs w:val="18"/>
+              </w:rPr>
+              <w:t>JWT + bcrypt, SQLite</w:t>
+            </w:r>
+          </w:p>
+        </w:tc>
+        <w:tc>
+          <w:tcPr>
+            <w:tcW w:w="4652" w:type="dxa"/>
+            <w:tcBorders>
+              <w:top w:val="single" w:sz="4" w:space="0" w:color="CCDDEE"/>
+              <w:left w:val="single" w:sz="4" w:space="0" w:color="CCDDEE"/>
+              <w:bottom w:val="single" w:sz="4" w:space="0" w:color="CCDDEE"/>
+              <w:right w:val="single" w:sz="4" w:space="0" w:color="CCDDEE"/>
+            </w:tcBorders>
+            <w:shd w:val="clear" w:color="auto" w:fill="F2F8FF"/>
+            <w:tcMar>
+              <w:top w:w="80" w:type="dxa"/>
+              <w:left w:w="120" w:type="dxa"/>
+              <w:bottom w:w="80" w:type="dxa"/>
+              <w:right w:w="120" w:type="dxa"/>
+            </w:tcMar>
+          </w:tcPr>
+          <w:p>
+            <w:pPr>
+              <w:spacing w:before="80" w:after="80" w:line="276" w:lineRule="auto"/>
+              <w:jc w:val="both"/>
+            </w:pPr>
+            <w:r>
+              <w:rPr>
+                <w:sz w:val="18"/>
+                <w:szCs w:val="18"/>
+              </w:rPr>
+              <w:t>Secures login with password hashing (bcrypt) and session tokens (JWT); user credentials are stored in a SQLite database.</w:t>
+            </w:r>
+          </w:p>
+        </w:tc>
+      </w:tr>
+      <w:tr>
+        <w:tc>
+          <w:tcPr>
+            <w:tcW w:w="2240" w:type="dxa"/>
+            <w:tcBorders>
+              <w:top w:val="single" w:sz="4" w:space="0" w:color="CCDDEE"/>
+              <w:left w:val="single" w:sz="4" w:space="0" w:color="CCDDEE"/>
+              <w:bottom w:val="single" w:sz="4" w:space="0" w:color="CCDDEE"/>
+              <w:right w:val="single" w:sz="4" w:space="0" w:color="CCDDEE"/>
+            </w:tcBorders>
+            <w:shd w:val="clear" w:color="auto" w:fill="FFFFFF"/>
+            <w:tcMar>
+              <w:top w:w="80" w:type="dxa"/>
+              <w:left w:w="120" w:type="dxa"/>
+              <w:bottom w:w="80" w:type="dxa"/>
+              <w:right w:w="120" w:type="dxa"/>
+            </w:tcMar>
+          </w:tcPr>
+          <w:p>
+            <w:pPr>
+              <w:spacing w:before="80" w:after="80" w:line="276" w:lineRule="auto"/>
+              <w:jc w:val="both"/>
+            </w:pPr>
+            <w:r>
+              <w:rPr>
+                <w:sz w:val="18"/>
+                <w:szCs w:val="18"/>
+              </w:rPr>
+              <w:t>Testing &amp; Quality Assurance</w:t>
+            </w:r>
+          </w:p>
+        </w:tc>
+        <w:tc>
+          <w:tcPr>
+            <w:tcW w:w="2520" w:type="dxa"/>
+            <w:tcBorders>
+              <w:top w:val="single" w:sz="4" w:space="0" w:color="CCDDEE"/>
+              <w:left w:val="single" w:sz="4" w:space="0" w:color="CCDDEE"/>
+              <w:bottom w:val="single" w:sz="4" w:space="0" w:color="CCDDEE"/>
+              <w:right w:val="single" w:sz="4" w:space="0" w:color="CCDDEE"/>
+            </w:tcBorders>
+            <w:shd w:val="clear" w:color="auto" w:fill="FFFFFF"/>
+            <w:tcMar>
+              <w:top w:w="80" w:type="dxa"/>
+              <w:left w:w="120" w:type="dxa"/>
+              <w:bottom w:w="80" w:type="dxa"/>
+              <w:right w:w="120" w:type="dxa"/>
+            </w:tcMar>
+          </w:tcPr>
+          <w:p>
+            <w:pPr>
+              <w:spacing w:before="80" w:after="80" w:line="276" w:lineRule="auto"/>
+              <w:jc w:val="both"/>
+            </w:pPr>
+            <w:r>
+              <w:rPr>
+                <w:sz w:val="18"/>
+                <w:szCs w:val="18"/>
+              </w:rPr>
+              <w:t>DeepEval + 96 unit tests</w:t>
+            </w:r>
+          </w:p>
+        </w:tc>
+        <w:tc>
+          <w:tcPr>
+            <w:tcW w:w="4652" w:type="dxa"/>
+            <w:tcBorders>
+              <w:top w:val="single" w:sz="4" w:space="0" w:color="CCDDEE"/>
+              <w:left w:val="single" w:sz="4" w:space="0" w:color="CCDDEE"/>
+              <w:bottom w:val="single" w:sz="4" w:space="0" w:color="CCDDEE"/>
+              <w:right w:val="single" w:sz="4" w:space="0" w:color="CCDDEE"/>
+            </w:tcBorders>
+            <w:shd w:val="clear" w:color="auto" w:fill="FFFFFF"/>
+            <w:tcMar>
+              <w:top w:w="80" w:type="dxa"/>
+              <w:left w:w="120" w:type="dxa"/>
+              <w:bottom w:w="80" w:type="dxa"/>
+              <w:right w:w="120" w:type="dxa"/>
+            </w:tcMar>
+          </w:tcPr>
+          <w:p>
+            <w:pPr>
+              <w:spacing w:before="80" w:after="80" w:line="276" w:lineRule="auto"/>
+              <w:jc w:val="both"/>
+            </w:pPr>
+            <w:r>
+              <w:rPr>
+                <w:sz w:val="18"/>
+                <w:szCs w:val="18"/>
+              </w:rPr>
+              <w:t>DeepEval checks AI answers for hallucination alongside RAGAS; 96 automated unit tests run in GitHub Actions on every push, with no manual step required.</w:t>
             </w:r>
           </w:p>
         </w:tc>
@@ -7973,19 +8015,19 @@
       <w:pPr>
         <w:pStyle w:val="Heading2"/>
       </w:pPr>
-      <w:proofErr w:type="gramStart"/>
-      <w:r>
-        <w:t>10.1  GitHub</w:t>
-      </w:r>
-      <w:proofErr w:type="gramEnd"/>
-      <w:r>
-        <w:t xml:space="preserve"> Repository</w:t>
+      <w:r>
+        <w:lastRenderedPageBreak/>
+        <w:t>10.1  GitHub Repository</w:t>
       </w:r>
     </w:p>
     <w:p>
       <w:pPr>
         <w:spacing w:before="80" w:after="80" w:line="276" w:lineRule="auto"/>
         <w:jc w:val="both"/>
+        <w:rPr>
+          <w:b/>
+          <w:bCs/>
+        </w:rPr>
       </w:pPr>
       <w:r>
         <w:t xml:space="preserve">GitHub Repository: </w:t>
@@ -8000,6 +8042,60 @@
     </w:p>
     <w:p>
       <w:pPr>
+        <w:spacing w:before="80" w:after="80" w:line="276" w:lineRule="auto"/>
+        <w:ind w:left="1440"/>
+        <w:jc w:val="both"/>
+        <w:rPr>
+          <w:b/>
+          <w:bCs/>
+        </w:rPr>
+      </w:pPr>
+      <w:r>
+        <w:rPr>
+          <w:b/>
+          <w:bCs/>
+        </w:rPr>
+        <w:t xml:space="preserve">     </w:t>
+      </w:r>
+      <w:r>
+        <w:rPr>
+          <w:b/>
+          <w:bCs/>
+        </w:rPr>
+        <w:t>github.com</w:t>
+      </w:r>
+      <w:r>
+        <w:rPr>
+          <w:b/>
+          <w:bCs/>
+        </w:rPr>
+        <w:t>/</w:t>
+      </w:r>
+      <w:r>
+        <w:rPr>
+          <w:b/>
+          <w:bCs/>
+        </w:rPr>
+        <w:t>ashusharma2002/</w:t>
+      </w:r>
+      <w:proofErr w:type="spellStart"/>
+      <w:r>
+        <w:rPr>
+          <w:b/>
+          <w:bCs/>
+        </w:rPr>
+        <w:t>Ey_Training_AI_ML_Assignments</w:t>
+      </w:r>
+      <w:proofErr w:type="spellEnd"/>
+    </w:p>
+    <w:p>
+      <w:pPr>
+        <w:spacing w:before="80" w:after="80" w:line="276" w:lineRule="auto"/>
+        <w:jc w:val="both"/>
+      </w:pPr>
+    </w:p>
+    <w:p>
+      <w:pPr>
         <w:spacing w:before="40" w:after="40" w:line="276" w:lineRule="auto"/>
         <w:jc w:val="both"/>
       </w:pPr>
@@ -8008,13 +8104,8 @@
       <w:pPr>
         <w:pStyle w:val="Heading2"/>
       </w:pPr>
-      <w:proofErr w:type="gramStart"/>
-      <w:r>
-        <w:t>10.2  Repository</w:t>
-      </w:r>
-      <w:proofErr w:type="gramEnd"/>
-      <w:r>
-        <w:t xml:space="preserve"> Architecture</w:t>
+      <w:r>
+        <w:t>10.2  Repository Architecture</w:t>
       </w:r>
     </w:p>
     <w:p>
@@ -8026,24 +8117,15 @@
         </w:numPr>
         <w:spacing w:before="40" w:after="40" w:line="276" w:lineRule="auto"/>
       </w:pPr>
-      <w:proofErr w:type="spellStart"/>
       <w:r>
         <w:rPr>
           <w:b/>
           <w:bCs/>
         </w:rPr>
-        <w:t>src</w:t>
-      </w:r>
-      <w:proofErr w:type="spellEnd"/>
-      <w:r>
-        <w:rPr>
-          <w:b/>
-          <w:bCs/>
-        </w:rPr>
-        <w:t xml:space="preserve">/agents/ </w:t>
-      </w:r>
-      <w:r>
-        <w:t>— Houses the distinct core modules for the AI agents, including the logic scripts for Retrieval, Reasoning, Summariser and Recommender agents.</w:t>
+        <w:t xml:space="preserve">src/agents/ </w:t>
+      </w:r>
+      <w:r>
+        <w:t>— Houses the distinct core modules for the AI agents, including the logic scripts for the Document, Retrieval and Chat agents.</w:t>
       </w:r>
     </w:p>
     <w:p>
@@ -8055,88 +8137,15 @@
         </w:numPr>
         <w:spacing w:before="40" w:after="40" w:line="276" w:lineRule="auto"/>
       </w:pPr>
-      <w:proofErr w:type="spellStart"/>
       <w:r>
         <w:rPr>
           <w:b/>
           <w:bCs/>
         </w:rPr>
-        <w:t>src</w:t>
-      </w:r>
-      <w:proofErr w:type="spellEnd"/>
-      <w:r>
-        <w:rPr>
-          <w:b/>
-          <w:bCs/>
-        </w:rPr>
-        <w:t>/</w:t>
-      </w:r>
-      <w:proofErr w:type="spellStart"/>
-      <w:r>
-        <w:rPr>
-          <w:b/>
-          <w:bCs/>
-        </w:rPr>
-        <w:t>ui</w:t>
-      </w:r>
-      <w:proofErr w:type="spellEnd"/>
-      <w:r>
-        <w:rPr>
-          <w:b/>
-          <w:bCs/>
-        </w:rPr>
-        <w:t xml:space="preserve">/ and </w:t>
-      </w:r>
-      <w:proofErr w:type="spellStart"/>
-      <w:r>
-        <w:rPr>
-          <w:b/>
-          <w:bCs/>
-        </w:rPr>
-        <w:t>src</w:t>
-      </w:r>
-      <w:proofErr w:type="spellEnd"/>
-      <w:r>
-        <w:rPr>
-          <w:b/>
-          <w:bCs/>
-        </w:rPr>
-        <w:t>/</w:t>
-      </w:r>
-      <w:proofErr w:type="spellStart"/>
-      <w:r>
-        <w:rPr>
-          <w:b/>
-          <w:bCs/>
-        </w:rPr>
-        <w:t>api</w:t>
-      </w:r>
-      <w:proofErr w:type="spellEnd"/>
-      <w:r>
-        <w:rPr>
-          <w:b/>
-          <w:bCs/>
-        </w:rPr>
-        <w:t xml:space="preserve">/ </w:t>
-      </w:r>
-      <w:r>
-        <w:t xml:space="preserve">— Contains the frontend </w:t>
-      </w:r>
-      <w:proofErr w:type="spellStart"/>
-      <w:r>
-        <w:t>Streamlit</w:t>
-      </w:r>
-      <w:proofErr w:type="spellEnd"/>
-      <w:r>
-        <w:t xml:space="preserve"> dashboards and the </w:t>
-      </w:r>
-      <w:proofErr w:type="spellStart"/>
-      <w:r>
-        <w:t>FastAPI</w:t>
-      </w:r>
-      <w:proofErr w:type="spellEnd"/>
-      <w:r>
-        <w:t xml:space="preserve"> backend endpoint routing interfaces.</w:t>
+        <w:t xml:space="preserve">src/ui/ and src/api/ </w:t>
+      </w:r>
+      <w:r>
+        <w:t>— Contains the frontend Streamlit dashboards and the FastAPI backend endpoint routing interfaces.</w:t>
       </w:r>
     </w:p>
     <w:p>
@@ -8153,32 +8162,7 @@
           <w:b/>
           <w:bCs/>
         </w:rPr>
-        <w:t xml:space="preserve">infra/ </w:t>
-      </w:r>
-      <w:proofErr w:type="gramStart"/>
-      <w:r>
-        <w:rPr>
-          <w:b/>
-          <w:bCs/>
-        </w:rPr>
-        <w:t>and .</w:t>
-      </w:r>
-      <w:proofErr w:type="spellStart"/>
-      <w:r>
-        <w:rPr>
-          <w:b/>
-          <w:bCs/>
-        </w:rPr>
-        <w:t>github</w:t>
-      </w:r>
-      <w:proofErr w:type="spellEnd"/>
-      <w:proofErr w:type="gramEnd"/>
-      <w:r>
-        <w:rPr>
-          <w:b/>
-          <w:bCs/>
-        </w:rPr>
-        <w:t xml:space="preserve">/workflows/ </w:t>
+        <w:t xml:space="preserve">infra/ and .github/workflows/ </w:t>
       </w:r>
       <w:r>
         <w:t>— Maintains the Azure Infrastructure as Code configurations and holds the automated CI/CD pipelines for linting and testing code.</w:t>
@@ -8194,13 +8178,8 @@
       <w:pPr>
         <w:pStyle w:val="Heading2"/>
       </w:pPr>
-      <w:proofErr w:type="gramStart"/>
-      <w:r>
-        <w:t>10.3  Team</w:t>
-      </w:r>
-      <w:proofErr w:type="gramEnd"/>
-      <w:r>
-        <w:t xml:space="preserve"> Roles and Responsibilities</w:t>
+      <w:r>
+        <w:t>10.3  Team Roles and Responsibilities</w:t>
       </w:r>
     </w:p>
     <w:p>
@@ -8239,12 +8218,6 @@
         <w:gridCol w:w="9412"/>
       </w:tblGrid>
       <w:tr>
-        <w:tblPrEx>
-          <w:tblCellMar>
-            <w:top w:w="0" w:type="dxa"/>
-            <w:bottom w:w="0" w:type="dxa"/>
-          </w:tblCellMar>
-        </w:tblPrEx>
         <w:tc>
           <w:tcPr>
             <w:tcW w:w="9412" w:type="dxa"/>
@@ -8289,7 +8262,7 @@
         <w:spacing w:before="40" w:after="40" w:line="276" w:lineRule="auto"/>
       </w:pPr>
       <w:r>
-        <w:t>Designed and implemented the complete multi-agent architecture including the Orchestrator, Retrieval Agent, Reasoning Agent, Summariser Agent and Recommender Agent.</w:t>
+        <w:t>Designed and implemented the complete multi-agent architecture including the Orchestrator, Document Agent, Retrieval Agent and Chat Agent, plus the AI cross-check step that verifies answers against source documents.</w:t>
       </w:r>
     </w:p>
     <w:p>
@@ -8302,23 +8275,7 @@
         <w:spacing w:before="40" w:after="40" w:line="276" w:lineRule="auto"/>
       </w:pPr>
       <w:r>
-        <w:t xml:space="preserve">Built the </w:t>
-      </w:r>
-      <w:proofErr w:type="spellStart"/>
-      <w:r>
-        <w:t>LangChain</w:t>
-      </w:r>
-      <w:proofErr w:type="spellEnd"/>
-      <w:r>
-        <w:t xml:space="preserve"> and </w:t>
-      </w:r>
-      <w:proofErr w:type="spellStart"/>
-      <w:r>
-        <w:t>LangGraph</w:t>
-      </w:r>
-      <w:proofErr w:type="spellEnd"/>
-      <w:r>
-        <w:t xml:space="preserve"> orchestration pipeline with full state management.</w:t>
+        <w:t>Built the LangChain and LangGraph orchestration pipeline with full state management.</w:t>
       </w:r>
     </w:p>
     <w:p>
@@ -8344,7 +8301,7 @@
         <w:spacing w:before="40" w:after="40" w:line="276" w:lineRule="auto"/>
       </w:pPr>
       <w:r>
-        <w:t>Integrated Gemini and OpenAI models as the LLM and embedding providers.</w:t>
+        <w:t>Integrated OpenAI, Groq and Gemini as the LLM providers in a 3-tier fallback chain, and built the JWT + bcrypt secure login system.</w:t>
       </w:r>
     </w:p>
     <w:p>
@@ -8374,12 +8331,6 @@
         <w:gridCol w:w="9412"/>
       </w:tblGrid>
       <w:tr>
-        <w:tblPrEx>
-          <w:tblCellMar>
-            <w:top w:w="0" w:type="dxa"/>
-            <w:bottom w:w="0" w:type="dxa"/>
-          </w:tblCellMar>
-        </w:tblPrEx>
         <w:tc>
           <w:tcPr>
             <w:tcW w:w="9412" w:type="dxa"/>
@@ -8437,7 +8388,7 @@
         <w:spacing w:before="40" w:after="40" w:line="276" w:lineRule="auto"/>
       </w:pPr>
       <w:r>
-        <w:t>Configured the FAISS vector store for semantic search and retrieval.</w:t>
+        <w:t>Configured the Pinecone vector store with BM25 hybrid search and year-aware re-ranking for semantic search and retrieval.</w:t>
       </w:r>
     </w:p>
     <w:p>
@@ -8450,7 +8401,6 @@
         <w:spacing w:before="40" w:after="40" w:line="276" w:lineRule="auto"/>
       </w:pPr>
       <w:r>
-        <w:lastRenderedPageBreak/>
         <w:t>Implemented the RAG pipeline ensuring all AI answers are grounded in uploaded documents.</w:t>
       </w:r>
     </w:p>
@@ -8494,12 +8444,6 @@
         <w:gridCol w:w="9412"/>
       </w:tblGrid>
       <w:tr>
-        <w:tblPrEx>
-          <w:tblCellMar>
-            <w:top w:w="0" w:type="dxa"/>
-            <w:bottom w:w="0" w:type="dxa"/>
-          </w:tblCellMar>
-        </w:tblPrEx>
         <w:tc>
           <w:tcPr>
             <w:tcW w:w="9412" w:type="dxa"/>
@@ -8544,15 +8488,7 @@
         <w:spacing w:before="40" w:after="40" w:line="276" w:lineRule="auto"/>
       </w:pPr>
       <w:r>
-        <w:t xml:space="preserve">Developed the full </w:t>
-      </w:r>
-      <w:proofErr w:type="spellStart"/>
-      <w:r>
-        <w:t>Streamlit</w:t>
-      </w:r>
-      <w:proofErr w:type="spellEnd"/>
-      <w:r>
-        <w:t xml:space="preserve"> dashboard including six pages — Upload, Document Summary, Risk Analysis, AI Recommendations, AI Chat and Dashboard.</w:t>
+        <w:t>Developed the full Streamlit dashboard including eight pages — Login/Register, Dashboard, Upload, Document Summary, Risk Analysis, AI Recommendations, AI Chat and Retirement Planner — with separate views for Customers and Financial Institutions.</w:t>
       </w:r>
     </w:p>
     <w:p>
@@ -8608,12 +8544,6 @@
         <w:gridCol w:w="9412"/>
       </w:tblGrid>
       <w:tr>
-        <w:tblPrEx>
-          <w:tblCellMar>
-            <w:top w:w="0" w:type="dxa"/>
-            <w:bottom w:w="0" w:type="dxa"/>
-          </w:tblCellMar>
-        </w:tblPrEx>
         <w:tc>
           <w:tcPr>
             <w:tcW w:w="9412" w:type="dxa"/>
@@ -8642,6 +8572,7 @@
                 <w:bCs/>
                 <w:color w:val="FFFFFF"/>
               </w:rPr>
+              <w:lastRenderedPageBreak/>
               <w:t>Project Setup &amp; Configuration</w:t>
             </w:r>
           </w:p>
@@ -8714,12 +8645,6 @@
         <w:gridCol w:w="9412"/>
       </w:tblGrid>
       <w:tr>
-        <w:tblPrEx>
-          <w:tblCellMar>
-            <w:top w:w="0" w:type="dxa"/>
-            <w:bottom w:w="0" w:type="dxa"/>
-          </w:tblCellMar>
-        </w:tblPrEx>
         <w:tc>
           <w:tcPr>
             <w:tcW w:w="9412" w:type="dxa"/>
@@ -8748,7 +8673,7 @@
                 <w:bCs/>
                 <w:color w:val="FFFFFF"/>
               </w:rPr>
-              <w:t>Documentation</w:t>
+              <w:t>Testing, DevOps &amp; Deployment</w:t>
             </w:r>
           </w:p>
         </w:tc>
@@ -8764,7 +8689,7 @@
         <w:spacing w:before="40" w:after="40" w:line="276" w:lineRule="auto"/>
       </w:pPr>
       <w:r>
-        <w:t>Wrote the complete PRD including Problem Statement, Proposed Solution, Architecture, Technology Stack and Workflow sections.</w:t>
+        <w:t>Wrote 96 automated unit tests covering authentication, the loan workflow, retrieval re-ranking, the retirement calculator and more, all running in GitHub Actions on every push.</w:t>
       </w:r>
     </w:p>
     <w:p>
@@ -8777,7 +8702,7 @@
         <w:spacing w:before="40" w:after="40" w:line="276" w:lineRule="auto"/>
       </w:pPr>
       <w:r>
-        <w:t>Created and maintained the architecture flow diagram and component walkthrough.</w:t>
+        <w:t>Added DeepEval hallucination checks alongside RAGAS, and set up LangSmith tracing across every agent step for debugging.</w:t>
       </w:r>
     </w:p>
     <w:p>
@@ -8790,7 +8715,7 @@
         <w:spacing w:before="40" w:after="40" w:line="276" w:lineRule="auto"/>
       </w:pPr>
       <w:r>
-        <w:t>Prepared the README, demo script and final presentation for Day 5.</w:t>
+        <w:t>Containerised the platform with Docker and set up the CI/CD pipeline that builds, tests and deploys automatically to Azure App Service via Azure Container Registry.</w:t>
       </w:r>
     </w:p>
     <w:p>
@@ -8820,12 +8745,6 @@
         <w:gridCol w:w="9412"/>
       </w:tblGrid>
       <w:tr>
-        <w:tblPrEx>
-          <w:tblCellMar>
-            <w:top w:w="0" w:type="dxa"/>
-            <w:bottom w:w="0" w:type="dxa"/>
-          </w:tblCellMar>
-        </w:tblPrEx>
         <w:tc>
           <w:tcPr>
             <w:tcW w:w="9412" w:type="dxa"/>
@@ -8854,7 +8773,7 @@
                 <w:bCs/>
                 <w:color w:val="FFFFFF"/>
               </w:rPr>
-              <w:t>Daily Collaboration</w:t>
+              <w:t>Documentation</w:t>
             </w:r>
           </w:p>
         </w:tc>
@@ -8870,7 +8789,7 @@
         <w:spacing w:before="40" w:after="40" w:line="276" w:lineRule="auto"/>
       </w:pPr>
       <w:r>
-        <w:t>Conducted daily sync meetings to track progress and resolve blockers.</w:t>
+        <w:t>Wrote the complete PRD including Problem Statement, Proposed Solution, Architecture, Technology Stack and Workflow sections.</w:t>
       </w:r>
     </w:p>
     <w:p>
@@ -8883,7 +8802,7 @@
         <w:spacing w:before="40" w:after="40" w:line="276" w:lineRule="auto"/>
       </w:pPr>
       <w:r>
-        <w:t>Performed end-to-end testing using sample HDFC financial documents.</w:t>
+        <w:t>Created and maintained the architecture flow diagram and component walkthrough.</w:t>
       </w:r>
     </w:p>
     <w:p>
@@ -8896,6 +8815,106 @@
         <w:spacing w:before="40" w:after="40" w:line="276" w:lineRule="auto"/>
       </w:pPr>
       <w:r>
+        <w:t>Prepared the README, demo script and final presentation for Day 5.</w:t>
+      </w:r>
+    </w:p>
+    <w:p>
+      <w:pPr>
+        <w:spacing w:before="40" w:after="40" w:line="276" w:lineRule="auto"/>
+        <w:jc w:val="both"/>
+      </w:pPr>
+    </w:p>
+    <w:tbl>
+      <w:tblPr>
+        <w:tblW w:w="9412" w:type="dxa"/>
+        <w:tblBorders>
+          <w:top w:val="single" w:sz="4" w:space="0" w:color="auto"/>
+          <w:left w:val="single" w:sz="4" w:space="0" w:color="auto"/>
+          <w:bottom w:val="single" w:sz="4" w:space="0" w:color="auto"/>
+          <w:right w:val="single" w:sz="4" w:space="0" w:color="auto"/>
+          <w:insideH w:val="single" w:sz="4" w:space="0" w:color="auto"/>
+          <w:insideV w:val="single" w:sz="4" w:space="0" w:color="auto"/>
+        </w:tblBorders>
+        <w:tblCellMar>
+          <w:left w:w="10" w:type="dxa"/>
+          <w:right w:w="10" w:type="dxa"/>
+        </w:tblCellMar>
+        <w:tblLook w:val="04A0" w:firstRow="1" w:lastRow="0" w:firstColumn="1" w:lastColumn="0" w:noHBand="0" w:noVBand="1"/>
+      </w:tblPr>
+      <w:tblGrid>
+        <w:gridCol w:w="9412"/>
+      </w:tblGrid>
+      <w:tr>
+        <w:tc>
+          <w:tcPr>
+            <w:tcW w:w="9412" w:type="dxa"/>
+            <w:tcBorders>
+              <w:top w:val="single" w:sz="4" w:space="0" w:color="CCDDEE"/>
+              <w:left w:val="single" w:sz="4" w:space="0" w:color="CCDDEE"/>
+              <w:bottom w:val="single" w:sz="4" w:space="0" w:color="CCDDEE"/>
+              <w:right w:val="single" w:sz="4" w:space="0" w:color="CCDDEE"/>
+            </w:tcBorders>
+            <w:shd w:val="clear" w:color="auto" w:fill="2E86AB"/>
+            <w:tcMar>
+              <w:top w:w="80" w:type="dxa"/>
+              <w:left w:w="140" w:type="dxa"/>
+              <w:bottom w:w="80" w:type="dxa"/>
+              <w:right w:w="120" w:type="dxa"/>
+            </w:tcMar>
+          </w:tcPr>
+          <w:p>
+            <w:pPr>
+              <w:spacing w:before="80" w:after="80" w:line="276" w:lineRule="auto"/>
+              <w:jc w:val="both"/>
+            </w:pPr>
+            <w:r>
+              <w:rPr>
+                <w:b/>
+                <w:bCs/>
+                <w:color w:val="FFFFFF"/>
+              </w:rPr>
+              <w:t>Daily Collaboration</w:t>
+            </w:r>
+          </w:p>
+        </w:tc>
+      </w:tr>
+    </w:tbl>
+    <w:p>
+      <w:pPr>
+        <w:pStyle w:val="ListParagraph"/>
+        <w:numPr>
+          <w:ilvl w:val="0"/>
+          <w:numId w:val="2"/>
+        </w:numPr>
+        <w:spacing w:before="40" w:after="40" w:line="276" w:lineRule="auto"/>
+      </w:pPr>
+      <w:r>
+        <w:t>Conducted daily sync meetings to track progress and resolve blockers.</w:t>
+      </w:r>
+    </w:p>
+    <w:p>
+      <w:pPr>
+        <w:pStyle w:val="ListParagraph"/>
+        <w:numPr>
+          <w:ilvl w:val="0"/>
+          <w:numId w:val="2"/>
+        </w:numPr>
+        <w:spacing w:before="40" w:after="40" w:line="276" w:lineRule="auto"/>
+      </w:pPr>
+      <w:r>
+        <w:t>Performed end-to-end testing using sample HDFC financial documents.</w:t>
+      </w:r>
+    </w:p>
+    <w:p>
+      <w:pPr>
+        <w:pStyle w:val="ListParagraph"/>
+        <w:numPr>
+          <w:ilvl w:val="0"/>
+          <w:numId w:val="2"/>
+        </w:numPr>
+        <w:spacing w:before="40" w:after="40" w:line="276" w:lineRule="auto"/>
+      </w:pPr>
+      <w:r>
         <w:t>Jointly delivered the final capstone presentation and live demo.</w:t>
       </w:r>
     </w:p>
@@ -8945,11 +8964,10 @@
         <w:rPr>
           <w:noProof/>
         </w:rPr>
-        <w:lastRenderedPageBreak/>
         <w:drawing>
-          <wp:inline distT="0" distB="0" distL="0" distR="0" wp14:anchorId="318E4262" wp14:editId="39956A31">
-            <wp:extent cx="5905500" cy="8572500"/>
-            <wp:effectExtent l="0" t="0" r="0" b="0"/>
+          <wp:inline distT="0" distB="0" distL="0" distR="0" wp14:anchorId="318E4262" wp14:editId="7AC48E85">
+            <wp:extent cx="5100602" cy="7404100"/>
+            <wp:effectExtent l="19050" t="19050" r="24130" b="25400"/>
             <wp:docPr id="1" name="diagram" descr="End-to-end data flow" title="Architecture Diagram"/>
             <wp:cNvGraphicFramePr>
               <a:graphicFrameLocks xmlns:a="http://schemas.openxmlformats.org/drawingml/2006/main" noChangeAspect="1"/>
@@ -8964,7 +8982,7 @@
                     </pic:cNvPicPr>
                   </pic:nvPicPr>
                   <pic:blipFill>
-                    <a:blip r:embed="rId7"/>
+                    <a:blip r:embed="rId9"/>
                     <a:srcRect/>
                     <a:stretch>
                       <a:fillRect/>
@@ -8973,11 +8991,16 @@
                   <pic:spPr bwMode="auto">
                     <a:xfrm>
                       <a:off x="0" y="0"/>
-                      <a:ext cx="5905500" cy="8572500"/>
+                      <a:ext cx="5102968" cy="7407535"/>
                     </a:xfrm>
                     <a:prstGeom prst="rect">
                       <a:avLst/>
                     </a:prstGeom>
+                    <a:ln>
+                      <a:solidFill>
+                        <a:schemeClr val="tx1"/>
+                      </a:solidFill>
+                    </a:ln>
                   </pic:spPr>
                 </pic:pic>
               </a:graphicData>
@@ -8987,8 +9010,8 @@
       </w:r>
     </w:p>
     <w:sectPr>
-      <w:headerReference w:type="default" r:id="rId8"/>
-      <w:footerReference w:type="default" r:id="rId9"/>
+      <w:headerReference w:type="default" r:id="rId10"/>
+      <w:footerReference w:type="default" r:id="rId11"/>
       <w:pgSz w:w="11906" w:h="16838"/>
       <w:pgMar w:top="1247" w:right="1247" w:bottom="1247" w:left="1247" w:header="708" w:footer="708" w:gutter="0"/>
       <w:cols w:space="720"/>
@@ -9744,6 +9767,7 @@
   <w:style w:type="character" w:default="1" w:styleId="DefaultParagraphFont">
     <w:name w:val="Default Paragraph Font"/>
     <w:uiPriority w:val="1"/>
+    <w:semiHidden/>
     <w:unhideWhenUsed/>
   </w:style>
   <w:style w:type="table" w:default="1" w:styleId="TableNormal">
@@ -9849,6 +9873,30 @@
     <w:rPr>
       <w:sz w:val="20"/>
       <w:szCs w:val="20"/>
+    </w:rPr>
+  </w:style>
+  <w:style w:type="character" w:styleId="UnresolvedMention">
+    <w:name w:val="Unresolved Mention"/>
+    <w:basedOn w:val="DefaultParagraphFont"/>
+    <w:uiPriority w:val="99"/>
+    <w:semiHidden/>
+    <w:unhideWhenUsed/>
+    <w:rsid w:val="00C51E89"/>
+    <w:rPr>
+      <w:color w:val="605E5C"/>
+      <w:shd w:val="clear" w:color="auto" w:fill="E1DFDD"/>
+    </w:rPr>
+  </w:style>
+  <w:style w:type="character" w:styleId="FollowedHyperlink">
+    <w:name w:val="FollowedHyperlink"/>
+    <w:basedOn w:val="DefaultParagraphFont"/>
+    <w:uiPriority w:val="99"/>
+    <w:semiHidden/>
+    <w:unhideWhenUsed/>
+    <w:rsid w:val="00555614"/>
+    <w:rPr>
+      <w:color w:val="954F72" w:themeColor="followedHyperlink"/>
+      <w:u w:val="single"/>
     </w:rPr>
   </w:style>
 </w:styles>

</xml_diff>